<commit_message>
feat: edit training plan page
</commit_message>
<xml_diff>
--- a/LISTA DE ALUNOS JANEIRO 26.docx
+++ b/LISTA DE ALUNOS JANEIRO 26.docx
@@ -278,7 +278,11 @@
           <w:tcPr>
             <w:tcW w:w="1018" w:type="dxa"/>
           </w:tcPr>
-          <w:p/>
+          <w:p>
+            <w:r>
+              <w:t>350,00</w:t>
+            </w:r>
+          </w:p>
         </w:tc>
         <w:tc>
           <w:tcPr>
@@ -339,7 +343,11 @@
           <w:tcPr>
             <w:tcW w:w="1018" w:type="dxa"/>
           </w:tcPr>
-          <w:p/>
+          <w:p>
+            <w:r>
+              <w:t>350,00</w:t>
+            </w:r>
+          </w:p>
         </w:tc>
         <w:tc>
           <w:tcPr>
@@ -402,7 +410,10 @@
           </w:tcPr>
           <w:p>
             <w:r>
-              <w:t>370,00</w:t>
+              <w:t>465</w:t>
+            </w:r>
+            <w:r>
+              <w:t>,00</w:t>
             </w:r>
           </w:p>
         </w:tc>
@@ -465,7 +476,11 @@
           <w:tcPr>
             <w:tcW w:w="1018" w:type="dxa"/>
           </w:tcPr>
-          <w:p/>
+          <w:p>
+            <w:r>
+              <w:t>450,00</w:t>
+            </w:r>
+          </w:p>
         </w:tc>
         <w:tc>
           <w:tcPr>
@@ -778,38 +793,34 @@
           <w:tcPr>
             <w:tcW w:w="1018" w:type="dxa"/>
           </w:tcPr>
-          <w:p/>
-        </w:tc>
-        <w:tc>
-          <w:tcPr>
-            <w:tcW w:w="1018" w:type="dxa"/>
-          </w:tcPr>
-          <w:p/>
-        </w:tc>
-      </w:tr>
-      <w:tr>
-        <w:tc>
-          <w:tcPr>
-            <w:tcW w:w="3823" w:type="dxa"/>
-          </w:tcPr>
-          <w:p>
-            <w:pPr>
-              <w:pStyle w:val="PargrafodaLista"/>
-              <w:numPr>
-                <w:ilvl w:val="0"/>
-                <w:numId w:val="2"/>
-              </w:numPr>
-            </w:pPr>
-            <w:r>
-              <w:t xml:space="preserve">RITA DE </w:t>
-            </w:r>
-            <w:proofErr w:type="gramStart"/>
-            <w:r>
-              <w:t>CASSIA  (</w:t>
-            </w:r>
-            <w:proofErr w:type="gramEnd"/>
-            <w:r>
-              <w:t>CASAL)</w:t>
+          <w:p>
+            <w:r>
+              <w:t>585,00</w:t>
+            </w:r>
+          </w:p>
+        </w:tc>
+        <w:tc>
+          <w:tcPr>
+            <w:tcW w:w="1018" w:type="dxa"/>
+          </w:tcPr>
+          <w:p/>
+        </w:tc>
+      </w:tr>
+      <w:tr>
+        <w:tc>
+          <w:tcPr>
+            <w:tcW w:w="3823" w:type="dxa"/>
+          </w:tcPr>
+          <w:p>
+            <w:pPr>
+              <w:pStyle w:val="PargrafodaLista"/>
+              <w:numPr>
+                <w:ilvl w:val="0"/>
+                <w:numId w:val="2"/>
+              </w:numPr>
+            </w:pPr>
+            <w:r>
+              <w:t>RITA DE CASSIA  (CASAL)</w:t>
             </w:r>
           </w:p>
         </w:tc>
@@ -1038,7 +1049,11 @@
           <w:tcPr>
             <w:tcW w:w="1018" w:type="dxa"/>
           </w:tcPr>
-          <w:p/>
+          <w:p>
+            <w:r>
+              <w:t>350,00</w:t>
+            </w:r>
+          </w:p>
         </w:tc>
         <w:tc>
           <w:tcPr>
@@ -1099,7 +1114,11 @@
           <w:tcPr>
             <w:tcW w:w="1018" w:type="dxa"/>
           </w:tcPr>
-          <w:p/>
+          <w:p>
+            <w:r>
+              <w:t>225,00</w:t>
+            </w:r>
+          </w:p>
         </w:tc>
         <w:tc>
           <w:tcPr>
@@ -1160,7 +1179,11 @@
           <w:tcPr>
             <w:tcW w:w="1018" w:type="dxa"/>
           </w:tcPr>
-          <w:p/>
+          <w:p>
+            <w:r>
+              <w:t>315,00</w:t>
+            </w:r>
+          </w:p>
         </w:tc>
         <w:tc>
           <w:tcPr>
@@ -1221,7 +1244,11 @@
           <w:tcPr>
             <w:tcW w:w="1018" w:type="dxa"/>
           </w:tcPr>
-          <w:p/>
+          <w:p>
+            <w:r>
+              <w:t>225,00</w:t>
+            </w:r>
+          </w:p>
         </w:tc>
         <w:tc>
           <w:tcPr>
@@ -1717,7 +1744,11 @@
           <w:tcPr>
             <w:tcW w:w="1018" w:type="dxa"/>
           </w:tcPr>
-          <w:p/>
+          <w:p>
+            <w:r>
+              <w:t>315,00</w:t>
+            </w:r>
+          </w:p>
         </w:tc>
         <w:tc>
           <w:tcPr>
@@ -1774,7 +1805,11 @@
           <w:tcPr>
             <w:tcW w:w="1018" w:type="dxa"/>
           </w:tcPr>
-          <w:p/>
+          <w:p>
+            <w:r>
+              <w:t>405,00</w:t>
+            </w:r>
+          </w:p>
         </w:tc>
         <w:tc>
           <w:tcPr>
@@ -1835,7 +1870,11 @@
           <w:tcPr>
             <w:tcW w:w="1018" w:type="dxa"/>
           </w:tcPr>
-          <w:p/>
+          <w:p>
+            <w:r>
+              <w:t>350,00</w:t>
+            </w:r>
+          </w:p>
         </w:tc>
         <w:tc>
           <w:tcPr>
@@ -1896,7 +1935,11 @@
           <w:tcPr>
             <w:tcW w:w="1018" w:type="dxa"/>
           </w:tcPr>
-          <w:p/>
+          <w:p>
+            <w:r>
+              <w:t>450,00</w:t>
+            </w:r>
+          </w:p>
         </w:tc>
         <w:tc>
           <w:tcPr>
@@ -2022,7 +2065,11 @@
           <w:tcPr>
             <w:tcW w:w="1018" w:type="dxa"/>
           </w:tcPr>
-          <w:p/>
+          <w:p>
+            <w:r>
+              <w:t>237,50</w:t>
+            </w:r>
+          </w:p>
         </w:tc>
         <w:tc>
           <w:tcPr>
@@ -2083,7 +2130,11 @@
           <w:tcPr>
             <w:tcW w:w="1018" w:type="dxa"/>
           </w:tcPr>
-          <w:p/>
+          <w:p>
+            <w:r>
+              <w:t>237,50</w:t>
+            </w:r>
+          </w:p>
         </w:tc>
         <w:tc>
           <w:tcPr>
@@ -2144,7 +2195,14 @@
           <w:tcPr>
             <w:tcW w:w="1018" w:type="dxa"/>
           </w:tcPr>
-          <w:p/>
+          <w:p>
+            <w:r>
+              <w:t>300,0</w:t>
+            </w:r>
+            <w:r>
+              <w:t>0</w:t>
+            </w:r>
+          </w:p>
         </w:tc>
         <w:tc>
           <w:tcPr>
@@ -2205,7 +2263,11 @@
           <w:tcPr>
             <w:tcW w:w="1018" w:type="dxa"/>
           </w:tcPr>
-          <w:p/>
+          <w:p>
+            <w:r>
+              <w:t>300,00</w:t>
+            </w:r>
+          </w:p>
         </w:tc>
         <w:tc>
           <w:tcPr>
@@ -2267,7 +2329,11 @@
           <w:tcPr>
             <w:tcW w:w="1018" w:type="dxa"/>
           </w:tcPr>
-          <w:p/>
+          <w:p>
+            <w:r>
+              <w:t>300,00</w:t>
+            </w:r>
+          </w:p>
         </w:tc>
         <w:tc>
           <w:tcPr>
@@ -2454,7 +2520,11 @@
           <w:tcPr>
             <w:tcW w:w="1018" w:type="dxa"/>
           </w:tcPr>
-          <w:p/>
+          <w:p>
+            <w:r>
+              <w:t>600,00</w:t>
+            </w:r>
+          </w:p>
         </w:tc>
         <w:tc>
           <w:tcPr>
@@ -2641,7 +2711,11 @@
           <w:tcPr>
             <w:tcW w:w="1018" w:type="dxa"/>
           </w:tcPr>
-          <w:p/>
+          <w:p>
+            <w:r>
+              <w:t>550,00</w:t>
+            </w:r>
+          </w:p>
         </w:tc>
         <w:tc>
           <w:tcPr>
@@ -2889,7 +2963,11 @@
           <w:tcPr>
             <w:tcW w:w="1018" w:type="dxa"/>
           </w:tcPr>
-          <w:p/>
+          <w:p>
+            <w:r>
+              <w:t>450,00</w:t>
+            </w:r>
+          </w:p>
         </w:tc>
         <w:tc>
           <w:tcPr>
@@ -2950,7 +3028,11 @@
           <w:tcPr>
             <w:tcW w:w="1018" w:type="dxa"/>
           </w:tcPr>
-          <w:p/>
+          <w:p>
+            <w:r>
+              <w:t>405,00</w:t>
+            </w:r>
+          </w:p>
         </w:tc>
         <w:tc>
           <w:tcPr>
@@ -3011,7 +3093,11 @@
           <w:tcPr>
             <w:tcW w:w="1018" w:type="dxa"/>
           </w:tcPr>
-          <w:p/>
+          <w:p>
+            <w:r>
+              <w:t>405,00</w:t>
+            </w:r>
+          </w:p>
         </w:tc>
         <w:tc>
           <w:tcPr>
@@ -3072,7 +3158,11 @@
           <w:tcPr>
             <w:tcW w:w="1018" w:type="dxa"/>
           </w:tcPr>
-          <w:p/>
+          <w:p>
+            <w:r>
+              <w:t>350,00</w:t>
+            </w:r>
+          </w:p>
         </w:tc>
         <w:tc>
           <w:tcPr>
@@ -3383,7 +3473,11 @@
           <w:tcPr>
             <w:tcW w:w="1018" w:type="dxa"/>
           </w:tcPr>
-          <w:p/>
+          <w:p>
+            <w:r>
+              <w:t>450,00</w:t>
+            </w:r>
+          </w:p>
         </w:tc>
         <w:tc>
           <w:tcPr>
@@ -3445,7 +3539,11 @@
           <w:tcPr>
             <w:tcW w:w="1018" w:type="dxa"/>
           </w:tcPr>
-          <w:p/>
+          <w:p>
+            <w:r>
+              <w:t>350,00</w:t>
+            </w:r>
+          </w:p>
         </w:tc>
         <w:tc>
           <w:tcPr>
@@ -3503,7 +3601,11 @@
           <w:tcPr>
             <w:tcW w:w="1018" w:type="dxa"/>
           </w:tcPr>
-          <w:p/>
+          <w:p>
+            <w:r>
+              <w:t>350,00</w:t>
+            </w:r>
+          </w:p>
         </w:tc>
         <w:tc>
           <w:tcPr>
@@ -3561,7 +3663,11 @@
           <w:tcPr>
             <w:tcW w:w="1018" w:type="dxa"/>
           </w:tcPr>
-          <w:p/>
+          <w:p>
+            <w:r>
+              <w:t>350,00</w:t>
+            </w:r>
+          </w:p>
         </w:tc>
         <w:tc>
           <w:tcPr>
@@ -3647,15 +3753,7 @@
               <w:jc w:val="both"/>
             </w:pPr>
             <w:r>
-              <w:t xml:space="preserve">ALINE </w:t>
-            </w:r>
-            <w:proofErr w:type="gramStart"/>
-            <w:r>
-              <w:t>AVILA  (</w:t>
-            </w:r>
-            <w:proofErr w:type="gramEnd"/>
-            <w:r>
-              <w:t>20)</w:t>
+              <w:t>ALINE AVILA  (20)</w:t>
             </w:r>
           </w:p>
         </w:tc>
@@ -3747,7 +3845,11 @@
           <w:tcPr>
             <w:tcW w:w="1018" w:type="dxa"/>
           </w:tcPr>
-          <w:p/>
+          <w:p>
+            <w:r>
+              <w:t>350,00</w:t>
+            </w:r>
+          </w:p>
         </w:tc>
         <w:tc>
           <w:tcPr>
@@ -3805,7 +3907,11 @@
           <w:tcPr>
             <w:tcW w:w="1018" w:type="dxa"/>
           </w:tcPr>
-          <w:p/>
+          <w:p>
+            <w:r>
+              <w:t>315,00</w:t>
+            </w:r>
+          </w:p>
         </w:tc>
         <w:tc>
           <w:tcPr>
@@ -3863,7 +3969,11 @@
           <w:tcPr>
             <w:tcW w:w="1018" w:type="dxa"/>
           </w:tcPr>
-          <w:p/>
+          <w:p>
+            <w:r>
+              <w:t>350,00</w:t>
+            </w:r>
+          </w:p>
         </w:tc>
         <w:tc>
           <w:tcPr>
@@ -4071,15 +4181,7 @@
           </w:tcPr>
           <w:p>
             <w:r>
-              <w:t xml:space="preserve">18 </w:t>
-            </w:r>
-            <w:proofErr w:type="gramStart"/>
-            <w:r>
-              <w:t>à</w:t>
-            </w:r>
-            <w:proofErr w:type="gramEnd"/>
-            <w:r>
-              <w:t xml:space="preserve"> 20</w:t>
+              <w:t>18 à 20</w:t>
             </w:r>
           </w:p>
         </w:tc>
@@ -4137,15 +4239,7 @@
           </w:tcPr>
           <w:p>
             <w:r>
-              <w:t xml:space="preserve">18 </w:t>
-            </w:r>
-            <w:proofErr w:type="gramStart"/>
-            <w:r>
-              <w:t>à</w:t>
-            </w:r>
-            <w:proofErr w:type="gramEnd"/>
-            <w:r>
-              <w:t xml:space="preserve"> 20</w:t>
+              <w:t>18 à 20</w:t>
             </w:r>
           </w:p>
         </w:tc>
@@ -4271,21 +4365,25 @@
           </w:tcPr>
           <w:p>
             <w:r>
-              <w:t>SEG/TER/QUA</w:t>
-            </w:r>
-          </w:p>
-        </w:tc>
-        <w:tc>
-          <w:tcPr>
-            <w:tcW w:w="1018" w:type="dxa"/>
-          </w:tcPr>
-          <w:p/>
-        </w:tc>
-        <w:tc>
-          <w:tcPr>
-            <w:tcW w:w="1018" w:type="dxa"/>
-          </w:tcPr>
-          <w:p/>
+              <w:t>SEG/QUA</w:t>
+            </w:r>
+          </w:p>
+        </w:tc>
+        <w:tc>
+          <w:tcPr>
+            <w:tcW w:w="1018" w:type="dxa"/>
+          </w:tcPr>
+          <w:p/>
+        </w:tc>
+        <w:tc>
+          <w:tcPr>
+            <w:tcW w:w="1018" w:type="dxa"/>
+          </w:tcPr>
+          <w:p>
+            <w:r>
+              <w:t>250,00</w:t>
+            </w:r>
+          </w:p>
         </w:tc>
         <w:tc>
           <w:tcPr>
@@ -4401,7 +4499,11 @@
           <w:tcPr>
             <w:tcW w:w="1018" w:type="dxa"/>
           </w:tcPr>
-          <w:p/>
+          <w:p>
+            <w:r>
+              <w:t>225,00</w:t>
+            </w:r>
+          </w:p>
         </w:tc>
         <w:tc>
           <w:tcPr>
@@ -4459,7 +4561,11 @@
           <w:tcPr>
             <w:tcW w:w="1018" w:type="dxa"/>
           </w:tcPr>
-          <w:p/>
+          <w:p>
+            <w:r>
+              <w:t>315,00</w:t>
+            </w:r>
+          </w:p>
         </w:tc>
         <w:tc>
           <w:tcPr>
@@ -4637,7 +4743,11 @@
           <w:tcPr>
             <w:tcW w:w="1018" w:type="dxa"/>
           </w:tcPr>
-          <w:p/>
+          <w:p>
+            <w:r>
+              <w:t>315,00</w:t>
+            </w:r>
+          </w:p>
         </w:tc>
         <w:tc>
           <w:tcPr>
@@ -4864,64 +4974,6 @@
           <w:p>
             <w:r>
               <w:t>SEG/QUA/SEX</w:t>
-            </w:r>
-          </w:p>
-        </w:tc>
-        <w:tc>
-          <w:tcPr>
-            <w:tcW w:w="1018" w:type="dxa"/>
-          </w:tcPr>
-          <w:p/>
-        </w:tc>
-        <w:tc>
-          <w:tcPr>
-            <w:tcW w:w="1018" w:type="dxa"/>
-          </w:tcPr>
-          <w:p/>
-        </w:tc>
-        <w:tc>
-          <w:tcPr>
-            <w:tcW w:w="1018" w:type="dxa"/>
-          </w:tcPr>
-          <w:p/>
-        </w:tc>
-      </w:tr>
-      <w:tr>
-        <w:tc>
-          <w:tcPr>
-            <w:tcW w:w="3823" w:type="dxa"/>
-          </w:tcPr>
-          <w:p>
-            <w:pPr>
-              <w:pStyle w:val="PargrafodaLista"/>
-              <w:numPr>
-                <w:ilvl w:val="0"/>
-                <w:numId w:val="2"/>
-              </w:numPr>
-              <w:jc w:val="both"/>
-            </w:pPr>
-            <w:r>
-              <w:t>TATIANA (29)</w:t>
-            </w:r>
-          </w:p>
-        </w:tc>
-        <w:tc>
-          <w:tcPr>
-            <w:tcW w:w="1275" w:type="dxa"/>
-          </w:tcPr>
-          <w:p>
-            <w:r>
-              <w:t>15</w:t>
-            </w:r>
-          </w:p>
-        </w:tc>
-        <w:tc>
-          <w:tcPr>
-            <w:tcW w:w="2410" w:type="dxa"/>
-          </w:tcPr>
-          <w:p>
-            <w:r>
-              <w:t>TER/QUI</w:t>
             </w:r>
           </w:p>
         </w:tc>
@@ -5379,8 +5431,66 @@
               <w:jc w:val="both"/>
             </w:pPr>
             <w:r>
+              <w:t>TÂNIA BIAZOTO 30</w:t>
+            </w:r>
+          </w:p>
+        </w:tc>
+        <w:tc>
+          <w:tcPr>
+            <w:tcW w:w="1275" w:type="dxa"/>
+          </w:tcPr>
+          <w:p>
+            <w:r>
+              <w:t>15</w:t>
+            </w:r>
+          </w:p>
+        </w:tc>
+        <w:tc>
+          <w:tcPr>
+            <w:tcW w:w="2410" w:type="dxa"/>
+          </w:tcPr>
+          <w:p>
+            <w:r>
+              <w:t>QUI</w:t>
+            </w:r>
+          </w:p>
+        </w:tc>
+        <w:tc>
+          <w:tcPr>
+            <w:tcW w:w="1018" w:type="dxa"/>
+          </w:tcPr>
+          <w:p/>
+        </w:tc>
+        <w:tc>
+          <w:tcPr>
+            <w:tcW w:w="1018" w:type="dxa"/>
+          </w:tcPr>
+          <w:p/>
+        </w:tc>
+        <w:tc>
+          <w:tcPr>
+            <w:tcW w:w="1018" w:type="dxa"/>
+          </w:tcPr>
+          <w:p/>
+        </w:tc>
+      </w:tr>
+      <w:tr>
+        <w:tc>
+          <w:tcPr>
+            <w:tcW w:w="3823" w:type="dxa"/>
+          </w:tcPr>
+          <w:p>
+            <w:pPr>
+              <w:pStyle w:val="PargrafodaLista"/>
+              <w:numPr>
+                <w:ilvl w:val="0"/>
+                <w:numId w:val="2"/>
+              </w:numPr>
+              <w:jc w:val="both"/>
+            </w:pPr>
+            <w:r>
               <w:lastRenderedPageBreak/>
-              <w:t>TÂNIA BIAZOTO 30</w:t>
+              <w:t>JOÃO MIGUEL 21</w:t>
             </w:r>
           </w:p>
         </w:tc>
@@ -5438,7 +5548,673 @@
               <w:jc w:val="both"/>
             </w:pPr>
             <w:r>
-              <w:t>JOÃO MIGUEL 21</w:t>
+              <w:t>ADALGISA 16</w:t>
+            </w:r>
+          </w:p>
+        </w:tc>
+        <w:tc>
+          <w:tcPr>
+            <w:tcW w:w="1275" w:type="dxa"/>
+          </w:tcPr>
+          <w:p>
+            <w:r>
+              <w:t>16</w:t>
+            </w:r>
+          </w:p>
+        </w:tc>
+        <w:tc>
+          <w:tcPr>
+            <w:tcW w:w="2410" w:type="dxa"/>
+          </w:tcPr>
+          <w:p>
+            <w:r>
+              <w:t>TER/QUI</w:t>
+            </w:r>
+          </w:p>
+        </w:tc>
+        <w:tc>
+          <w:tcPr>
+            <w:tcW w:w="1018" w:type="dxa"/>
+          </w:tcPr>
+          <w:p/>
+        </w:tc>
+        <w:tc>
+          <w:tcPr>
+            <w:tcW w:w="1018" w:type="dxa"/>
+          </w:tcPr>
+          <w:p>
+            <w:r>
+              <w:t>PG ATÉ MAIO</w:t>
+            </w:r>
+          </w:p>
+        </w:tc>
+        <w:tc>
+          <w:tcPr>
+            <w:tcW w:w="1018" w:type="dxa"/>
+          </w:tcPr>
+          <w:p/>
+        </w:tc>
+      </w:tr>
+      <w:tr>
+        <w:tc>
+          <w:tcPr>
+            <w:tcW w:w="3823" w:type="dxa"/>
+          </w:tcPr>
+          <w:p>
+            <w:pPr>
+              <w:pStyle w:val="PargrafodaLista"/>
+              <w:numPr>
+                <w:ilvl w:val="0"/>
+                <w:numId w:val="2"/>
+              </w:numPr>
+              <w:jc w:val="both"/>
+            </w:pPr>
+            <w:r>
+              <w:t>BRUNA AGOSTINI (CASAL) 27 10%</w:t>
+            </w:r>
+          </w:p>
+        </w:tc>
+        <w:tc>
+          <w:tcPr>
+            <w:tcW w:w="1275" w:type="dxa"/>
+          </w:tcPr>
+          <w:p>
+            <w:r>
+              <w:t>15:30 A 16:00</w:t>
+            </w:r>
+          </w:p>
+        </w:tc>
+        <w:tc>
+          <w:tcPr>
+            <w:tcW w:w="2410" w:type="dxa"/>
+          </w:tcPr>
+          <w:p>
+            <w:r>
+              <w:t>SEG/QUA/SEX</w:t>
+            </w:r>
+          </w:p>
+        </w:tc>
+        <w:tc>
+          <w:tcPr>
+            <w:tcW w:w="1018" w:type="dxa"/>
+          </w:tcPr>
+          <w:p/>
+        </w:tc>
+        <w:tc>
+          <w:tcPr>
+            <w:tcW w:w="1018" w:type="dxa"/>
+          </w:tcPr>
+          <w:p>
+            <w:r>
+              <w:t>315,00</w:t>
+            </w:r>
+          </w:p>
+        </w:tc>
+        <w:tc>
+          <w:tcPr>
+            <w:tcW w:w="1018" w:type="dxa"/>
+          </w:tcPr>
+          <w:p/>
+        </w:tc>
+      </w:tr>
+      <w:tr>
+        <w:tc>
+          <w:tcPr>
+            <w:tcW w:w="3823" w:type="dxa"/>
+          </w:tcPr>
+          <w:p>
+            <w:pPr>
+              <w:pStyle w:val="PargrafodaLista"/>
+              <w:numPr>
+                <w:ilvl w:val="0"/>
+                <w:numId w:val="2"/>
+              </w:numPr>
+              <w:jc w:val="both"/>
+            </w:pPr>
+            <w:r>
+              <w:t>DR. JULIO 28</w:t>
+            </w:r>
+          </w:p>
+        </w:tc>
+        <w:tc>
+          <w:tcPr>
+            <w:tcW w:w="1275" w:type="dxa"/>
+          </w:tcPr>
+          <w:p>
+            <w:r>
+              <w:t>5:15/8</w:t>
+            </w:r>
+          </w:p>
+        </w:tc>
+        <w:tc>
+          <w:tcPr>
+            <w:tcW w:w="2410" w:type="dxa"/>
+          </w:tcPr>
+          <w:p>
+            <w:r>
+              <w:t>TER/QUI/SÁB</w:t>
+            </w:r>
+          </w:p>
+        </w:tc>
+        <w:tc>
+          <w:tcPr>
+            <w:tcW w:w="1018" w:type="dxa"/>
+          </w:tcPr>
+          <w:p/>
+        </w:tc>
+        <w:tc>
+          <w:tcPr>
+            <w:tcW w:w="1018" w:type="dxa"/>
+          </w:tcPr>
+          <w:p/>
+        </w:tc>
+        <w:tc>
+          <w:tcPr>
+            <w:tcW w:w="1018" w:type="dxa"/>
+          </w:tcPr>
+          <w:p/>
+        </w:tc>
+      </w:tr>
+      <w:tr>
+        <w:tc>
+          <w:tcPr>
+            <w:tcW w:w="3823" w:type="dxa"/>
+          </w:tcPr>
+          <w:p>
+            <w:pPr>
+              <w:pStyle w:val="PargrafodaLista"/>
+              <w:numPr>
+                <w:ilvl w:val="0"/>
+                <w:numId w:val="2"/>
+              </w:numPr>
+              <w:jc w:val="both"/>
+            </w:pPr>
+            <w:r>
+              <w:t>VITÓRIA GOMES 03</w:t>
+            </w:r>
+          </w:p>
+        </w:tc>
+        <w:tc>
+          <w:tcPr>
+            <w:tcW w:w="1275" w:type="dxa"/>
+          </w:tcPr>
+          <w:p>
+            <w:r>
+              <w:t>6</w:t>
+            </w:r>
+          </w:p>
+        </w:tc>
+        <w:tc>
+          <w:tcPr>
+            <w:tcW w:w="2410" w:type="dxa"/>
+          </w:tcPr>
+          <w:p>
+            <w:r>
+              <w:t>SEG À SEX</w:t>
+            </w:r>
+          </w:p>
+        </w:tc>
+        <w:tc>
+          <w:tcPr>
+            <w:tcW w:w="1018" w:type="dxa"/>
+          </w:tcPr>
+          <w:p/>
+        </w:tc>
+        <w:tc>
+          <w:tcPr>
+            <w:tcW w:w="1018" w:type="dxa"/>
+          </w:tcPr>
+          <w:p>
+            <w:r>
+              <w:t>550,00</w:t>
+            </w:r>
+          </w:p>
+        </w:tc>
+        <w:tc>
+          <w:tcPr>
+            <w:tcW w:w="1018" w:type="dxa"/>
+          </w:tcPr>
+          <w:p/>
+        </w:tc>
+      </w:tr>
+      <w:tr>
+        <w:tc>
+          <w:tcPr>
+            <w:tcW w:w="3823" w:type="dxa"/>
+          </w:tcPr>
+          <w:p>
+            <w:pPr>
+              <w:pStyle w:val="PargrafodaLista"/>
+              <w:numPr>
+                <w:ilvl w:val="0"/>
+                <w:numId w:val="2"/>
+              </w:numPr>
+              <w:jc w:val="both"/>
+            </w:pPr>
+            <w:r>
+              <w:t>ANA PAULA S. 3</w:t>
+            </w:r>
+          </w:p>
+        </w:tc>
+        <w:tc>
+          <w:tcPr>
+            <w:tcW w:w="1275" w:type="dxa"/>
+          </w:tcPr>
+          <w:p>
+            <w:r>
+              <w:t>17/5/5</w:t>
+            </w:r>
+          </w:p>
+        </w:tc>
+        <w:tc>
+          <w:tcPr>
+            <w:tcW w:w="2410" w:type="dxa"/>
+          </w:tcPr>
+          <w:p>
+            <w:r>
+              <w:t>SEG/QUA/SEX</w:t>
+            </w:r>
+          </w:p>
+        </w:tc>
+        <w:tc>
+          <w:tcPr>
+            <w:tcW w:w="1018" w:type="dxa"/>
+          </w:tcPr>
+          <w:p/>
+        </w:tc>
+        <w:tc>
+          <w:tcPr>
+            <w:tcW w:w="1018" w:type="dxa"/>
+          </w:tcPr>
+          <w:p>
+            <w:r>
+              <w:t>350,00</w:t>
+            </w:r>
+          </w:p>
+        </w:tc>
+        <w:tc>
+          <w:tcPr>
+            <w:tcW w:w="1018" w:type="dxa"/>
+          </w:tcPr>
+          <w:p/>
+        </w:tc>
+      </w:tr>
+      <w:tr>
+        <w:tc>
+          <w:tcPr>
+            <w:tcW w:w="3823" w:type="dxa"/>
+          </w:tcPr>
+          <w:p>
+            <w:pPr>
+              <w:pStyle w:val="PargrafodaLista"/>
+              <w:numPr>
+                <w:ilvl w:val="0"/>
+                <w:numId w:val="2"/>
+              </w:numPr>
+              <w:jc w:val="both"/>
+            </w:pPr>
+            <w:r>
+              <w:t>DONA ZILA 3</w:t>
+            </w:r>
+          </w:p>
+        </w:tc>
+        <w:tc>
+          <w:tcPr>
+            <w:tcW w:w="1275" w:type="dxa"/>
+          </w:tcPr>
+          <w:p>
+            <w:r>
+              <w:t>10</w:t>
+            </w:r>
+          </w:p>
+        </w:tc>
+        <w:tc>
+          <w:tcPr>
+            <w:tcW w:w="2410" w:type="dxa"/>
+          </w:tcPr>
+          <w:p>
+            <w:r>
+              <w:t>SEG/QUI</w:t>
+            </w:r>
+          </w:p>
+        </w:tc>
+        <w:tc>
+          <w:tcPr>
+            <w:tcW w:w="1018" w:type="dxa"/>
+          </w:tcPr>
+          <w:p/>
+        </w:tc>
+        <w:tc>
+          <w:tcPr>
+            <w:tcW w:w="1018" w:type="dxa"/>
+          </w:tcPr>
+          <w:p>
+            <w:r>
+              <w:t>350,00</w:t>
+            </w:r>
+          </w:p>
+        </w:tc>
+        <w:tc>
+          <w:tcPr>
+            <w:tcW w:w="1018" w:type="dxa"/>
+          </w:tcPr>
+          <w:p/>
+        </w:tc>
+      </w:tr>
+      <w:tr>
+        <w:tc>
+          <w:tcPr>
+            <w:tcW w:w="3823" w:type="dxa"/>
+          </w:tcPr>
+          <w:p>
+            <w:pPr>
+              <w:pStyle w:val="PargrafodaLista"/>
+              <w:numPr>
+                <w:ilvl w:val="0"/>
+                <w:numId w:val="2"/>
+              </w:numPr>
+              <w:jc w:val="both"/>
+            </w:pPr>
+            <w:r>
+              <w:t>ELISANGELA 13</w:t>
+            </w:r>
+          </w:p>
+        </w:tc>
+        <w:tc>
+          <w:tcPr>
+            <w:tcW w:w="1275" w:type="dxa"/>
+          </w:tcPr>
+          <w:p>
+            <w:r>
+              <w:t>16</w:t>
+            </w:r>
+          </w:p>
+        </w:tc>
+        <w:tc>
+          <w:tcPr>
+            <w:tcW w:w="2410" w:type="dxa"/>
+          </w:tcPr>
+          <w:p>
+            <w:r>
+              <w:t>SEG/TER/QUI</w:t>
+            </w:r>
+          </w:p>
+        </w:tc>
+        <w:tc>
+          <w:tcPr>
+            <w:tcW w:w="1018" w:type="dxa"/>
+          </w:tcPr>
+          <w:p/>
+        </w:tc>
+        <w:tc>
+          <w:tcPr>
+            <w:tcW w:w="1018" w:type="dxa"/>
+          </w:tcPr>
+          <w:p/>
+        </w:tc>
+        <w:tc>
+          <w:tcPr>
+            <w:tcW w:w="1018" w:type="dxa"/>
+          </w:tcPr>
+          <w:p/>
+        </w:tc>
+      </w:tr>
+      <w:tr>
+        <w:tc>
+          <w:tcPr>
+            <w:tcW w:w="3823" w:type="dxa"/>
+          </w:tcPr>
+          <w:p>
+            <w:pPr>
+              <w:pStyle w:val="PargrafodaLista"/>
+              <w:numPr>
+                <w:ilvl w:val="0"/>
+                <w:numId w:val="2"/>
+              </w:numPr>
+              <w:jc w:val="both"/>
+            </w:pPr>
+            <w:r>
+              <w:t>CRISTIANE 27</w:t>
+            </w:r>
+          </w:p>
+        </w:tc>
+        <w:tc>
+          <w:tcPr>
+            <w:tcW w:w="1275" w:type="dxa"/>
+          </w:tcPr>
+          <w:p>
+            <w:r>
+              <w:t>6</w:t>
+            </w:r>
+          </w:p>
+        </w:tc>
+        <w:tc>
+          <w:tcPr>
+            <w:tcW w:w="2410" w:type="dxa"/>
+          </w:tcPr>
+          <w:p>
+            <w:r>
+              <w:t>SEG/QUA/QUI</w:t>
+            </w:r>
+          </w:p>
+        </w:tc>
+        <w:tc>
+          <w:tcPr>
+            <w:tcW w:w="1018" w:type="dxa"/>
+          </w:tcPr>
+          <w:p/>
+        </w:tc>
+        <w:tc>
+          <w:tcPr>
+            <w:tcW w:w="1018" w:type="dxa"/>
+          </w:tcPr>
+          <w:p/>
+        </w:tc>
+        <w:tc>
+          <w:tcPr>
+            <w:tcW w:w="1018" w:type="dxa"/>
+          </w:tcPr>
+          <w:p/>
+        </w:tc>
+      </w:tr>
+      <w:tr>
+        <w:tc>
+          <w:tcPr>
+            <w:tcW w:w="3823" w:type="dxa"/>
+          </w:tcPr>
+          <w:p>
+            <w:pPr>
+              <w:pStyle w:val="PargrafodaLista"/>
+              <w:numPr>
+                <w:ilvl w:val="0"/>
+                <w:numId w:val="2"/>
+              </w:numPr>
+              <w:jc w:val="both"/>
+            </w:pPr>
+            <w:r>
+              <w:t>FABIOLA 25</w:t>
+            </w:r>
+          </w:p>
+        </w:tc>
+        <w:tc>
+          <w:tcPr>
+            <w:tcW w:w="1275" w:type="dxa"/>
+          </w:tcPr>
+          <w:p>
+            <w:r>
+              <w:t>17</w:t>
+            </w:r>
+          </w:p>
+        </w:tc>
+        <w:tc>
+          <w:tcPr>
+            <w:tcW w:w="2410" w:type="dxa"/>
+          </w:tcPr>
+          <w:p>
+            <w:r>
+              <w:t>TER/QUA/QUI</w:t>
+            </w:r>
+          </w:p>
+        </w:tc>
+        <w:tc>
+          <w:tcPr>
+            <w:tcW w:w="1018" w:type="dxa"/>
+          </w:tcPr>
+          <w:p/>
+        </w:tc>
+        <w:tc>
+          <w:tcPr>
+            <w:tcW w:w="1018" w:type="dxa"/>
+          </w:tcPr>
+          <w:p/>
+        </w:tc>
+        <w:tc>
+          <w:tcPr>
+            <w:tcW w:w="1018" w:type="dxa"/>
+          </w:tcPr>
+          <w:p/>
+        </w:tc>
+      </w:tr>
+      <w:tr>
+        <w:tc>
+          <w:tcPr>
+            <w:tcW w:w="3823" w:type="dxa"/>
+          </w:tcPr>
+          <w:p>
+            <w:pPr>
+              <w:pStyle w:val="PargrafodaLista"/>
+              <w:numPr>
+                <w:ilvl w:val="0"/>
+                <w:numId w:val="2"/>
+              </w:numPr>
+              <w:jc w:val="both"/>
+            </w:pPr>
+            <w:r>
+              <w:t>LILLYAN 3</w:t>
+            </w:r>
+          </w:p>
+        </w:tc>
+        <w:tc>
+          <w:tcPr>
+            <w:tcW w:w="1275" w:type="dxa"/>
+          </w:tcPr>
+          <w:p>
+            <w:r>
+              <w:t>7</w:t>
+            </w:r>
+          </w:p>
+        </w:tc>
+        <w:tc>
+          <w:tcPr>
+            <w:tcW w:w="2410" w:type="dxa"/>
+          </w:tcPr>
+          <w:p>
+            <w:r>
+              <w:t>SEG À SEX</w:t>
+            </w:r>
+          </w:p>
+        </w:tc>
+        <w:tc>
+          <w:tcPr>
+            <w:tcW w:w="1018" w:type="dxa"/>
+          </w:tcPr>
+          <w:p/>
+        </w:tc>
+        <w:tc>
+          <w:tcPr>
+            <w:tcW w:w="1018" w:type="dxa"/>
+          </w:tcPr>
+          <w:p>
+            <w:r>
+              <w:t>550,00</w:t>
+            </w:r>
+          </w:p>
+        </w:tc>
+        <w:tc>
+          <w:tcPr>
+            <w:tcW w:w="1018" w:type="dxa"/>
+          </w:tcPr>
+          <w:p/>
+        </w:tc>
+      </w:tr>
+      <w:tr>
+        <w:tc>
+          <w:tcPr>
+            <w:tcW w:w="3823" w:type="dxa"/>
+          </w:tcPr>
+          <w:p>
+            <w:pPr>
+              <w:pStyle w:val="PargrafodaLista"/>
+              <w:numPr>
+                <w:ilvl w:val="0"/>
+                <w:numId w:val="2"/>
+              </w:numPr>
+              <w:jc w:val="both"/>
+            </w:pPr>
+            <w:r>
+              <w:t>DANIELA RUCH 3</w:t>
+            </w:r>
+          </w:p>
+        </w:tc>
+        <w:tc>
+          <w:tcPr>
+            <w:tcW w:w="1275" w:type="dxa"/>
+          </w:tcPr>
+          <w:p>
+            <w:r>
+              <w:t>17</w:t>
+            </w:r>
+          </w:p>
+        </w:tc>
+        <w:tc>
+          <w:tcPr>
+            <w:tcW w:w="2410" w:type="dxa"/>
+          </w:tcPr>
+          <w:p>
+            <w:r>
+              <w:t>QUA/SEX</w:t>
+            </w:r>
+          </w:p>
+        </w:tc>
+        <w:tc>
+          <w:tcPr>
+            <w:tcW w:w="1018" w:type="dxa"/>
+          </w:tcPr>
+          <w:p/>
+        </w:tc>
+        <w:tc>
+          <w:tcPr>
+            <w:tcW w:w="1018" w:type="dxa"/>
+          </w:tcPr>
+          <w:p>
+            <w:r>
+              <w:t>250,00</w:t>
+            </w:r>
+          </w:p>
+        </w:tc>
+        <w:tc>
+          <w:tcPr>
+            <w:tcW w:w="1018" w:type="dxa"/>
+          </w:tcPr>
+          <w:p/>
+        </w:tc>
+      </w:tr>
+      <w:tr>
+        <w:tc>
+          <w:tcPr>
+            <w:tcW w:w="3823" w:type="dxa"/>
+          </w:tcPr>
+          <w:p>
+            <w:pPr>
+              <w:pStyle w:val="PargrafodaLista"/>
+              <w:numPr>
+                <w:ilvl w:val="0"/>
+                <w:numId w:val="2"/>
+              </w:numPr>
+              <w:jc w:val="both"/>
+            </w:pPr>
+            <w:r>
+              <w:t>ILIÊ VIDAL</w:t>
             </w:r>
           </w:p>
         </w:tc>
@@ -5458,30 +6234,37 @@
           </w:tcPr>
           <w:p>
             <w:r>
-              <w:t>QUI</w:t>
-            </w:r>
-          </w:p>
-        </w:tc>
-        <w:tc>
-          <w:tcPr>
-            <w:tcW w:w="1018" w:type="dxa"/>
-          </w:tcPr>
-          <w:p/>
-        </w:tc>
-        <w:tc>
-          <w:tcPr>
-            <w:tcW w:w="1018" w:type="dxa"/>
-          </w:tcPr>
-          <w:p/>
-        </w:tc>
-        <w:tc>
-          <w:tcPr>
-            <w:tcW w:w="1018" w:type="dxa"/>
-          </w:tcPr>
-          <w:p/>
-        </w:tc>
-      </w:tr>
-      <w:tr>
+              <w:t>SEG/QUA/SEX</w:t>
+            </w:r>
+          </w:p>
+        </w:tc>
+        <w:tc>
+          <w:tcPr>
+            <w:tcW w:w="1018" w:type="dxa"/>
+          </w:tcPr>
+          <w:p/>
+        </w:tc>
+        <w:tc>
+          <w:tcPr>
+            <w:tcW w:w="1018" w:type="dxa"/>
+          </w:tcPr>
+          <w:p>
+            <w:r>
+              <w:t>350,00</w:t>
+            </w:r>
+          </w:p>
+        </w:tc>
+        <w:tc>
+          <w:tcPr>
+            <w:tcW w:w="1018" w:type="dxa"/>
+          </w:tcPr>
+          <w:p/>
+        </w:tc>
+      </w:tr>
+      <w:tr>
+        <w:trPr>
+          <w:trHeight w:val="77"/>
+        </w:trPr>
         <w:tc>
           <w:tcPr>
             <w:tcW w:w="3823" w:type="dxa"/>
@@ -5496,7 +6279,993 @@
               <w:jc w:val="both"/>
             </w:pPr>
             <w:r>
-              <w:t>ADALGISA 16</w:t>
+              <w:t>KATHELYN</w:t>
+            </w:r>
+          </w:p>
+        </w:tc>
+        <w:tc>
+          <w:tcPr>
+            <w:tcW w:w="1275" w:type="dxa"/>
+          </w:tcPr>
+          <w:p>
+            <w:r>
+              <w:t>6</w:t>
+            </w:r>
+          </w:p>
+        </w:tc>
+        <w:tc>
+          <w:tcPr>
+            <w:tcW w:w="2410" w:type="dxa"/>
+          </w:tcPr>
+          <w:p>
+            <w:r>
+              <w:t>SEG/QUA/SEX</w:t>
+            </w:r>
+          </w:p>
+        </w:tc>
+        <w:tc>
+          <w:tcPr>
+            <w:tcW w:w="1018" w:type="dxa"/>
+          </w:tcPr>
+          <w:p/>
+        </w:tc>
+        <w:tc>
+          <w:tcPr>
+            <w:tcW w:w="1018" w:type="dxa"/>
+          </w:tcPr>
+          <w:p>
+            <w:r>
+              <w:t>350,00</w:t>
+            </w:r>
+          </w:p>
+        </w:tc>
+        <w:tc>
+          <w:tcPr>
+            <w:tcW w:w="1018" w:type="dxa"/>
+          </w:tcPr>
+          <w:p/>
+        </w:tc>
+      </w:tr>
+      <w:tr>
+        <w:tc>
+          <w:tcPr>
+            <w:tcW w:w="3823" w:type="dxa"/>
+          </w:tcPr>
+          <w:p>
+            <w:pPr>
+              <w:pStyle w:val="PargrafodaLista"/>
+              <w:numPr>
+                <w:ilvl w:val="0"/>
+                <w:numId w:val="2"/>
+              </w:numPr>
+              <w:jc w:val="both"/>
+            </w:pPr>
+            <w:r>
+              <w:t>NÁDIA ROCHA</w:t>
+            </w:r>
+          </w:p>
+        </w:tc>
+        <w:tc>
+          <w:tcPr>
+            <w:tcW w:w="1275" w:type="dxa"/>
+          </w:tcPr>
+          <w:p>
+            <w:r>
+              <w:t>5</w:t>
+            </w:r>
+          </w:p>
+        </w:tc>
+        <w:tc>
+          <w:tcPr>
+            <w:tcW w:w="2410" w:type="dxa"/>
+          </w:tcPr>
+          <w:p>
+            <w:r>
+              <w:t>TER/QUA</w:t>
+            </w:r>
+          </w:p>
+        </w:tc>
+        <w:tc>
+          <w:tcPr>
+            <w:tcW w:w="1018" w:type="dxa"/>
+          </w:tcPr>
+          <w:p/>
+        </w:tc>
+        <w:tc>
+          <w:tcPr>
+            <w:tcW w:w="1018" w:type="dxa"/>
+          </w:tcPr>
+          <w:p>
+            <w:r>
+              <w:t>225,00</w:t>
+            </w:r>
+          </w:p>
+        </w:tc>
+        <w:tc>
+          <w:tcPr>
+            <w:tcW w:w="1018" w:type="dxa"/>
+          </w:tcPr>
+          <w:p/>
+        </w:tc>
+      </w:tr>
+      <w:tr>
+        <w:tc>
+          <w:tcPr>
+            <w:tcW w:w="3823" w:type="dxa"/>
+          </w:tcPr>
+          <w:p>
+            <w:pPr>
+              <w:pStyle w:val="PargrafodaLista"/>
+              <w:numPr>
+                <w:ilvl w:val="0"/>
+                <w:numId w:val="2"/>
+              </w:numPr>
+              <w:jc w:val="both"/>
+            </w:pPr>
+            <w:r>
+              <w:t>ELIEZER ROCHA</w:t>
+            </w:r>
+          </w:p>
+        </w:tc>
+        <w:tc>
+          <w:tcPr>
+            <w:tcW w:w="1275" w:type="dxa"/>
+          </w:tcPr>
+          <w:p>
+            <w:r>
+              <w:t>5</w:t>
+            </w:r>
+          </w:p>
+        </w:tc>
+        <w:tc>
+          <w:tcPr>
+            <w:tcW w:w="2410" w:type="dxa"/>
+          </w:tcPr>
+          <w:p>
+            <w:r>
+              <w:t>TER/QUI</w:t>
+            </w:r>
+          </w:p>
+        </w:tc>
+        <w:tc>
+          <w:tcPr>
+            <w:tcW w:w="1018" w:type="dxa"/>
+          </w:tcPr>
+          <w:p/>
+        </w:tc>
+        <w:tc>
+          <w:tcPr>
+            <w:tcW w:w="1018" w:type="dxa"/>
+          </w:tcPr>
+          <w:p>
+            <w:r>
+              <w:t>225,00</w:t>
+            </w:r>
+          </w:p>
+        </w:tc>
+        <w:tc>
+          <w:tcPr>
+            <w:tcW w:w="1018" w:type="dxa"/>
+          </w:tcPr>
+          <w:p/>
+        </w:tc>
+      </w:tr>
+      <w:tr>
+        <w:tc>
+          <w:tcPr>
+            <w:tcW w:w="3823" w:type="dxa"/>
+          </w:tcPr>
+          <w:p>
+            <w:pPr>
+              <w:pStyle w:val="PargrafodaLista"/>
+              <w:numPr>
+                <w:ilvl w:val="0"/>
+                <w:numId w:val="2"/>
+              </w:numPr>
+              <w:jc w:val="both"/>
+            </w:pPr>
+            <w:r>
+              <w:t xml:space="preserve">TATIANA </w:t>
+            </w:r>
+          </w:p>
+        </w:tc>
+        <w:tc>
+          <w:tcPr>
+            <w:tcW w:w="1275" w:type="dxa"/>
+          </w:tcPr>
+          <w:p>
+            <w:r>
+              <w:t>5</w:t>
+            </w:r>
+          </w:p>
+        </w:tc>
+        <w:tc>
+          <w:tcPr>
+            <w:tcW w:w="2410" w:type="dxa"/>
+          </w:tcPr>
+          <w:p>
+            <w:r>
+              <w:t>TER/QUI</w:t>
+            </w:r>
+          </w:p>
+        </w:tc>
+        <w:tc>
+          <w:tcPr>
+            <w:tcW w:w="1018" w:type="dxa"/>
+          </w:tcPr>
+          <w:p/>
+        </w:tc>
+        <w:tc>
+          <w:tcPr>
+            <w:tcW w:w="1018" w:type="dxa"/>
+          </w:tcPr>
+          <w:p>
+            <w:r>
+              <w:t>350,00</w:t>
+            </w:r>
+          </w:p>
+        </w:tc>
+        <w:tc>
+          <w:tcPr>
+            <w:tcW w:w="1018" w:type="dxa"/>
+          </w:tcPr>
+          <w:p/>
+        </w:tc>
+      </w:tr>
+      <w:tr>
+        <w:tc>
+          <w:tcPr>
+            <w:tcW w:w="3823" w:type="dxa"/>
+          </w:tcPr>
+          <w:p>
+            <w:pPr>
+              <w:pStyle w:val="PargrafodaLista"/>
+              <w:numPr>
+                <w:ilvl w:val="0"/>
+                <w:numId w:val="2"/>
+              </w:numPr>
+              <w:jc w:val="both"/>
+            </w:pPr>
+            <w:r>
+              <w:t>BRUNO AGUIAR</w:t>
+            </w:r>
+          </w:p>
+        </w:tc>
+        <w:tc>
+          <w:tcPr>
+            <w:tcW w:w="1275" w:type="dxa"/>
+          </w:tcPr>
+          <w:p>
+            <w:r>
+              <w:t>5</w:t>
+            </w:r>
+          </w:p>
+        </w:tc>
+        <w:tc>
+          <w:tcPr>
+            <w:tcW w:w="2410" w:type="dxa"/>
+          </w:tcPr>
+          <w:p>
+            <w:r>
+              <w:t>QUA/SEX</w:t>
+            </w:r>
+          </w:p>
+        </w:tc>
+        <w:tc>
+          <w:tcPr>
+            <w:tcW w:w="1018" w:type="dxa"/>
+          </w:tcPr>
+          <w:p/>
+        </w:tc>
+        <w:tc>
+          <w:tcPr>
+            <w:tcW w:w="1018" w:type="dxa"/>
+          </w:tcPr>
+          <w:p>
+            <w:r>
+              <w:t>250,00</w:t>
+            </w:r>
+          </w:p>
+        </w:tc>
+        <w:tc>
+          <w:tcPr>
+            <w:tcW w:w="1018" w:type="dxa"/>
+          </w:tcPr>
+          <w:p/>
+        </w:tc>
+      </w:tr>
+      <w:tr>
+        <w:tc>
+          <w:tcPr>
+            <w:tcW w:w="3823" w:type="dxa"/>
+          </w:tcPr>
+          <w:p>
+            <w:pPr>
+              <w:pStyle w:val="PargrafodaLista"/>
+              <w:numPr>
+                <w:ilvl w:val="0"/>
+                <w:numId w:val="2"/>
+              </w:numPr>
+              <w:jc w:val="both"/>
+            </w:pPr>
+            <w:r>
+              <w:t>BACANINHA</w:t>
+            </w:r>
+          </w:p>
+        </w:tc>
+        <w:tc>
+          <w:tcPr>
+            <w:tcW w:w="1275" w:type="dxa"/>
+          </w:tcPr>
+          <w:p>
+            <w:r>
+              <w:t>5</w:t>
+            </w:r>
+          </w:p>
+        </w:tc>
+        <w:tc>
+          <w:tcPr>
+            <w:tcW w:w="2410" w:type="dxa"/>
+          </w:tcPr>
+          <w:p/>
+        </w:tc>
+        <w:tc>
+          <w:tcPr>
+            <w:tcW w:w="1018" w:type="dxa"/>
+          </w:tcPr>
+          <w:p/>
+        </w:tc>
+        <w:tc>
+          <w:tcPr>
+            <w:tcW w:w="1018" w:type="dxa"/>
+          </w:tcPr>
+          <w:p>
+            <w:r>
+              <w:t>350,00</w:t>
+            </w:r>
+          </w:p>
+        </w:tc>
+        <w:tc>
+          <w:tcPr>
+            <w:tcW w:w="1018" w:type="dxa"/>
+          </w:tcPr>
+          <w:p/>
+        </w:tc>
+      </w:tr>
+      <w:tr>
+        <w:tc>
+          <w:tcPr>
+            <w:tcW w:w="3823" w:type="dxa"/>
+          </w:tcPr>
+          <w:p>
+            <w:pPr>
+              <w:pStyle w:val="PargrafodaLista"/>
+              <w:numPr>
+                <w:ilvl w:val="0"/>
+                <w:numId w:val="2"/>
+              </w:numPr>
+              <w:jc w:val="both"/>
+            </w:pPr>
+            <w:r>
+              <w:t>MARISA</w:t>
+            </w:r>
+          </w:p>
+        </w:tc>
+        <w:tc>
+          <w:tcPr>
+            <w:tcW w:w="1275" w:type="dxa"/>
+          </w:tcPr>
+          <w:p>
+            <w:r>
+              <w:t>9</w:t>
+            </w:r>
+          </w:p>
+        </w:tc>
+        <w:tc>
+          <w:tcPr>
+            <w:tcW w:w="2410" w:type="dxa"/>
+          </w:tcPr>
+          <w:p>
+            <w:r>
+              <w:t>SEG/QUA/SEX</w:t>
+            </w:r>
+          </w:p>
+        </w:tc>
+        <w:tc>
+          <w:tcPr>
+            <w:tcW w:w="1018" w:type="dxa"/>
+          </w:tcPr>
+          <w:p/>
+        </w:tc>
+        <w:tc>
+          <w:tcPr>
+            <w:tcW w:w="1018" w:type="dxa"/>
+          </w:tcPr>
+          <w:p>
+            <w:r>
+              <w:t>350,00</w:t>
+            </w:r>
+          </w:p>
+        </w:tc>
+        <w:tc>
+          <w:tcPr>
+            <w:tcW w:w="1018" w:type="dxa"/>
+          </w:tcPr>
+          <w:p>
+            <w:r>
+              <w:t xml:space="preserve"> </w:t>
+            </w:r>
+          </w:p>
+        </w:tc>
+      </w:tr>
+      <w:tr>
+        <w:tc>
+          <w:tcPr>
+            <w:tcW w:w="3823" w:type="dxa"/>
+          </w:tcPr>
+          <w:p>
+            <w:pPr>
+              <w:pStyle w:val="PargrafodaLista"/>
+              <w:numPr>
+                <w:ilvl w:val="0"/>
+                <w:numId w:val="2"/>
+              </w:numPr>
+              <w:jc w:val="both"/>
+            </w:pPr>
+            <w:r>
+              <w:t>MARIANA BISOGNIN</w:t>
+            </w:r>
+          </w:p>
+        </w:tc>
+        <w:tc>
+          <w:tcPr>
+            <w:tcW w:w="1275" w:type="dxa"/>
+          </w:tcPr>
+          <w:p>
+            <w:r>
+              <w:t>17</w:t>
+            </w:r>
+          </w:p>
+        </w:tc>
+        <w:tc>
+          <w:tcPr>
+            <w:tcW w:w="2410" w:type="dxa"/>
+          </w:tcPr>
+          <w:p>
+            <w:r>
+              <w:t>TER/QUA</w:t>
+            </w:r>
+          </w:p>
+        </w:tc>
+        <w:tc>
+          <w:tcPr>
+            <w:tcW w:w="1018" w:type="dxa"/>
+          </w:tcPr>
+          <w:p/>
+        </w:tc>
+        <w:tc>
+          <w:tcPr>
+            <w:tcW w:w="1018" w:type="dxa"/>
+          </w:tcPr>
+          <w:p>
+            <w:r>
+              <w:t>350,00</w:t>
+            </w:r>
+          </w:p>
+        </w:tc>
+        <w:tc>
+          <w:tcPr>
+            <w:tcW w:w="1018" w:type="dxa"/>
+          </w:tcPr>
+          <w:p/>
+        </w:tc>
+      </w:tr>
+      <w:tr>
+        <w:tc>
+          <w:tcPr>
+            <w:tcW w:w="3823" w:type="dxa"/>
+          </w:tcPr>
+          <w:p>
+            <w:pPr>
+              <w:pStyle w:val="PargrafodaLista"/>
+              <w:numPr>
+                <w:ilvl w:val="0"/>
+                <w:numId w:val="2"/>
+              </w:numPr>
+              <w:jc w:val="both"/>
+            </w:pPr>
+            <w:r>
+              <w:t>R</w:t>
+            </w:r>
+            <w:r>
+              <w:t>AFAEL POSSIK</w:t>
+            </w:r>
+          </w:p>
+        </w:tc>
+        <w:tc>
+          <w:tcPr>
+            <w:tcW w:w="1275" w:type="dxa"/>
+          </w:tcPr>
+          <w:p>
+            <w:r>
+              <w:t>19</w:t>
+            </w:r>
+          </w:p>
+        </w:tc>
+        <w:tc>
+          <w:tcPr>
+            <w:tcW w:w="2410" w:type="dxa"/>
+          </w:tcPr>
+          <w:p>
+            <w:r>
+              <w:t>QUA/SEX</w:t>
+            </w:r>
+          </w:p>
+        </w:tc>
+        <w:tc>
+          <w:tcPr>
+            <w:tcW w:w="1018" w:type="dxa"/>
+          </w:tcPr>
+          <w:p/>
+        </w:tc>
+        <w:tc>
+          <w:tcPr>
+            <w:tcW w:w="1018" w:type="dxa"/>
+          </w:tcPr>
+          <w:p>
+            <w:r>
+              <w:t>1.000,00</w:t>
+            </w:r>
+          </w:p>
+        </w:tc>
+        <w:tc>
+          <w:tcPr>
+            <w:tcW w:w="1018" w:type="dxa"/>
+          </w:tcPr>
+          <w:p/>
+        </w:tc>
+      </w:tr>
+      <w:tr>
+        <w:tc>
+          <w:tcPr>
+            <w:tcW w:w="3823" w:type="dxa"/>
+          </w:tcPr>
+          <w:p>
+            <w:pPr>
+              <w:pStyle w:val="PargrafodaLista"/>
+              <w:numPr>
+                <w:ilvl w:val="0"/>
+                <w:numId w:val="2"/>
+              </w:numPr>
+              <w:jc w:val="both"/>
+            </w:pPr>
+            <w:r>
+              <w:t>JULIA CUEL</w:t>
+            </w:r>
+          </w:p>
+        </w:tc>
+        <w:tc>
+          <w:tcPr>
+            <w:tcW w:w="1275" w:type="dxa"/>
+          </w:tcPr>
+          <w:p>
+            <w:r>
+              <w:t>9/16</w:t>
+            </w:r>
+          </w:p>
+        </w:tc>
+        <w:tc>
+          <w:tcPr>
+            <w:tcW w:w="2410" w:type="dxa"/>
+          </w:tcPr>
+          <w:p>
+            <w:r>
+              <w:t>SEG/QUA/SEX</w:t>
+            </w:r>
+          </w:p>
+        </w:tc>
+        <w:tc>
+          <w:tcPr>
+            <w:tcW w:w="1018" w:type="dxa"/>
+          </w:tcPr>
+          <w:p/>
+        </w:tc>
+        <w:tc>
+          <w:tcPr>
+            <w:tcW w:w="1018" w:type="dxa"/>
+          </w:tcPr>
+          <w:p>
+            <w:r>
+              <w:t>450,00</w:t>
+            </w:r>
+          </w:p>
+        </w:tc>
+        <w:tc>
+          <w:tcPr>
+            <w:tcW w:w="1018" w:type="dxa"/>
+          </w:tcPr>
+          <w:p/>
+        </w:tc>
+      </w:tr>
+      <w:tr>
+        <w:tc>
+          <w:tcPr>
+            <w:tcW w:w="3823" w:type="dxa"/>
+          </w:tcPr>
+          <w:p>
+            <w:pPr>
+              <w:pStyle w:val="PargrafodaLista"/>
+              <w:numPr>
+                <w:ilvl w:val="0"/>
+                <w:numId w:val="2"/>
+              </w:numPr>
+              <w:jc w:val="both"/>
+            </w:pPr>
+            <w:r>
+              <w:t>CAMILA GABBI</w:t>
+            </w:r>
+          </w:p>
+        </w:tc>
+        <w:tc>
+          <w:tcPr>
+            <w:tcW w:w="1275" w:type="dxa"/>
+          </w:tcPr>
+          <w:p>
+            <w:r>
+              <w:t>17</w:t>
+            </w:r>
+          </w:p>
+        </w:tc>
+        <w:tc>
+          <w:tcPr>
+            <w:tcW w:w="2410" w:type="dxa"/>
+          </w:tcPr>
+          <w:p>
+            <w:r>
+              <w:t>SEG/QUA</w:t>
+            </w:r>
+          </w:p>
+        </w:tc>
+        <w:tc>
+          <w:tcPr>
+            <w:tcW w:w="1018" w:type="dxa"/>
+          </w:tcPr>
+          <w:p/>
+        </w:tc>
+        <w:tc>
+          <w:tcPr>
+            <w:tcW w:w="1018" w:type="dxa"/>
+          </w:tcPr>
+          <w:p>
+            <w:r>
+              <w:t>350,00</w:t>
+            </w:r>
+          </w:p>
+        </w:tc>
+        <w:tc>
+          <w:tcPr>
+            <w:tcW w:w="1018" w:type="dxa"/>
+          </w:tcPr>
+          <w:p/>
+        </w:tc>
+      </w:tr>
+      <w:tr>
+        <w:tc>
+          <w:tcPr>
+            <w:tcW w:w="3823" w:type="dxa"/>
+          </w:tcPr>
+          <w:p>
+            <w:pPr>
+              <w:pStyle w:val="PargrafodaLista"/>
+              <w:numPr>
+                <w:ilvl w:val="0"/>
+                <w:numId w:val="2"/>
+              </w:numPr>
+              <w:jc w:val="both"/>
+            </w:pPr>
+            <w:r>
+              <w:t>LUCIENE BRAGA</w:t>
+            </w:r>
+          </w:p>
+        </w:tc>
+        <w:tc>
+          <w:tcPr>
+            <w:tcW w:w="1275" w:type="dxa"/>
+          </w:tcPr>
+          <w:p>
+            <w:r>
+              <w:t>9/18</w:t>
+            </w:r>
+          </w:p>
+        </w:tc>
+        <w:tc>
+          <w:tcPr>
+            <w:tcW w:w="2410" w:type="dxa"/>
+          </w:tcPr>
+          <w:p>
+            <w:r>
+              <w:t>SEG/QUA/SEX</w:t>
+            </w:r>
+          </w:p>
+        </w:tc>
+        <w:tc>
+          <w:tcPr>
+            <w:tcW w:w="1018" w:type="dxa"/>
+          </w:tcPr>
+          <w:p/>
+        </w:tc>
+        <w:tc>
+          <w:tcPr>
+            <w:tcW w:w="1018" w:type="dxa"/>
+          </w:tcPr>
+          <w:p/>
+        </w:tc>
+        <w:tc>
+          <w:tcPr>
+            <w:tcW w:w="1018" w:type="dxa"/>
+          </w:tcPr>
+          <w:p/>
+        </w:tc>
+      </w:tr>
+      <w:tr>
+        <w:tc>
+          <w:tcPr>
+            <w:tcW w:w="3823" w:type="dxa"/>
+          </w:tcPr>
+          <w:p>
+            <w:pPr>
+              <w:pStyle w:val="PargrafodaLista"/>
+              <w:numPr>
+                <w:ilvl w:val="0"/>
+                <w:numId w:val="2"/>
+              </w:numPr>
+              <w:jc w:val="both"/>
+            </w:pPr>
+            <w:r>
+              <w:t>TONY XANDU</w:t>
+            </w:r>
+          </w:p>
+        </w:tc>
+        <w:tc>
+          <w:tcPr>
+            <w:tcW w:w="1275" w:type="dxa"/>
+          </w:tcPr>
+          <w:p>
+            <w:r>
+              <w:t>19</w:t>
+            </w:r>
+          </w:p>
+        </w:tc>
+        <w:tc>
+          <w:tcPr>
+            <w:tcW w:w="2410" w:type="dxa"/>
+          </w:tcPr>
+          <w:p>
+            <w:r>
+              <w:t>SEG/TER/QUI</w:t>
+            </w:r>
+          </w:p>
+        </w:tc>
+        <w:tc>
+          <w:tcPr>
+            <w:tcW w:w="1018" w:type="dxa"/>
+          </w:tcPr>
+          <w:p/>
+        </w:tc>
+        <w:tc>
+          <w:tcPr>
+            <w:tcW w:w="1018" w:type="dxa"/>
+          </w:tcPr>
+          <w:p>
+            <w:r>
+              <w:t>350,00</w:t>
+            </w:r>
+          </w:p>
+        </w:tc>
+        <w:tc>
+          <w:tcPr>
+            <w:tcW w:w="1018" w:type="dxa"/>
+          </w:tcPr>
+          <w:p/>
+        </w:tc>
+      </w:tr>
+      <w:tr>
+        <w:tc>
+          <w:tcPr>
+            <w:tcW w:w="3823" w:type="dxa"/>
+          </w:tcPr>
+          <w:p>
+            <w:pPr>
+              <w:pStyle w:val="PargrafodaLista"/>
+              <w:numPr>
+                <w:ilvl w:val="0"/>
+                <w:numId w:val="2"/>
+              </w:numPr>
+              <w:jc w:val="both"/>
+            </w:pPr>
+            <w:r>
+              <w:t>TATIANE ROCHA</w:t>
+            </w:r>
+          </w:p>
+        </w:tc>
+        <w:tc>
+          <w:tcPr>
+            <w:tcW w:w="1275" w:type="dxa"/>
+          </w:tcPr>
+          <w:p>
+            <w:r>
+              <w:t>5</w:t>
+            </w:r>
+          </w:p>
+        </w:tc>
+        <w:tc>
+          <w:tcPr>
+            <w:tcW w:w="2410" w:type="dxa"/>
+          </w:tcPr>
+          <w:p>
+            <w:r>
+              <w:t>TER/QUI</w:t>
+            </w:r>
+          </w:p>
+        </w:tc>
+        <w:tc>
+          <w:tcPr>
+            <w:tcW w:w="1018" w:type="dxa"/>
+          </w:tcPr>
+          <w:p/>
+        </w:tc>
+        <w:tc>
+          <w:tcPr>
+            <w:tcW w:w="1018" w:type="dxa"/>
+          </w:tcPr>
+          <w:p>
+            <w:r>
+              <w:t>350,00</w:t>
+            </w:r>
+          </w:p>
+        </w:tc>
+        <w:tc>
+          <w:tcPr>
+            <w:tcW w:w="1018" w:type="dxa"/>
+          </w:tcPr>
+          <w:p/>
+        </w:tc>
+      </w:tr>
+      <w:tr>
+        <w:tc>
+          <w:tcPr>
+            <w:tcW w:w="3823" w:type="dxa"/>
+          </w:tcPr>
+          <w:p>
+            <w:pPr>
+              <w:pStyle w:val="PargrafodaLista"/>
+              <w:numPr>
+                <w:ilvl w:val="0"/>
+                <w:numId w:val="2"/>
+              </w:numPr>
+              <w:jc w:val="both"/>
+            </w:pPr>
+            <w:r>
+              <w:t>REGIS CANOVA</w:t>
+            </w:r>
+          </w:p>
+        </w:tc>
+        <w:tc>
+          <w:tcPr>
+            <w:tcW w:w="1275" w:type="dxa"/>
+          </w:tcPr>
+          <w:p>
+            <w:r>
+              <w:t>18:30</w:t>
+            </w:r>
+          </w:p>
+        </w:tc>
+        <w:tc>
+          <w:tcPr>
+            <w:tcW w:w="2410" w:type="dxa"/>
+          </w:tcPr>
+          <w:p>
+            <w:r>
+              <w:t>TER/QUI</w:t>
+            </w:r>
+          </w:p>
+        </w:tc>
+        <w:tc>
+          <w:tcPr>
+            <w:tcW w:w="1018" w:type="dxa"/>
+          </w:tcPr>
+          <w:p/>
+        </w:tc>
+        <w:tc>
+          <w:tcPr>
+            <w:tcW w:w="1018" w:type="dxa"/>
+          </w:tcPr>
+          <w:p/>
+        </w:tc>
+        <w:tc>
+          <w:tcPr>
+            <w:tcW w:w="1018" w:type="dxa"/>
+          </w:tcPr>
+          <w:p/>
+        </w:tc>
+      </w:tr>
+      <w:tr>
+        <w:tc>
+          <w:tcPr>
+            <w:tcW w:w="3823" w:type="dxa"/>
+          </w:tcPr>
+          <w:p>
+            <w:pPr>
+              <w:pStyle w:val="PargrafodaLista"/>
+              <w:numPr>
+                <w:ilvl w:val="0"/>
+                <w:numId w:val="2"/>
+              </w:numPr>
+              <w:jc w:val="both"/>
+            </w:pPr>
+            <w:r>
+              <w:t>LIANDRA CANOVA</w:t>
+            </w:r>
+          </w:p>
+        </w:tc>
+        <w:tc>
+          <w:tcPr>
+            <w:tcW w:w="1275" w:type="dxa"/>
+          </w:tcPr>
+          <w:p>
+            <w:r>
+              <w:t>17</w:t>
+            </w:r>
+          </w:p>
+        </w:tc>
+        <w:tc>
+          <w:tcPr>
+            <w:tcW w:w="2410" w:type="dxa"/>
+          </w:tcPr>
+          <w:p>
+            <w:r>
+              <w:t>TER/QUI</w:t>
+            </w:r>
+          </w:p>
+        </w:tc>
+        <w:tc>
+          <w:tcPr>
+            <w:tcW w:w="1018" w:type="dxa"/>
+          </w:tcPr>
+          <w:p/>
+        </w:tc>
+        <w:tc>
+          <w:tcPr>
+            <w:tcW w:w="1018" w:type="dxa"/>
+          </w:tcPr>
+          <w:p/>
+        </w:tc>
+        <w:tc>
+          <w:tcPr>
+            <w:tcW w:w="1018" w:type="dxa"/>
+          </w:tcPr>
+          <w:p/>
+        </w:tc>
+      </w:tr>
+      <w:tr>
+        <w:tc>
+          <w:tcPr>
+            <w:tcW w:w="3823" w:type="dxa"/>
+          </w:tcPr>
+          <w:p>
+            <w:pPr>
+              <w:pStyle w:val="PargrafodaLista"/>
+              <w:numPr>
+                <w:ilvl w:val="0"/>
+                <w:numId w:val="2"/>
+              </w:numPr>
+              <w:jc w:val="both"/>
+            </w:pPr>
+            <w:r>
+              <w:t>E</w:t>
+            </w:r>
+            <w:r>
+              <w:t>DILEUZA</w:t>
             </w:r>
           </w:p>
         </w:tc>
@@ -5516,23 +7285,23 @@
           </w:tcPr>
           <w:p>
             <w:r>
-              <w:t>TER/QUI</w:t>
-            </w:r>
-          </w:p>
-        </w:tc>
-        <w:tc>
-          <w:tcPr>
-            <w:tcW w:w="1018" w:type="dxa"/>
-          </w:tcPr>
-          <w:p/>
-        </w:tc>
-        <w:tc>
-          <w:tcPr>
-            <w:tcW w:w="1018" w:type="dxa"/>
-          </w:tcPr>
-          <w:p>
-            <w:r>
-              <w:t>PG ATÉ MAIO</w:t>
+              <w:t>SEG/SEX</w:t>
+            </w:r>
+          </w:p>
+        </w:tc>
+        <w:tc>
+          <w:tcPr>
+            <w:tcW w:w="1018" w:type="dxa"/>
+          </w:tcPr>
+          <w:p/>
+        </w:tc>
+        <w:tc>
+          <w:tcPr>
+            <w:tcW w:w="1018" w:type="dxa"/>
+          </w:tcPr>
+          <w:p>
+            <w:r>
+              <w:t>225,00</w:t>
             </w:r>
           </w:p>
         </w:tc>
@@ -5558,17 +7327,256 @@
               <w:jc w:val="both"/>
             </w:pPr>
             <w:r>
-              <w:t>BRUNA AGOSTINI (CASAL) 27 10%</w:t>
-            </w:r>
-          </w:p>
-        </w:tc>
-        <w:tc>
-          <w:tcPr>
-            <w:tcW w:w="1275" w:type="dxa"/>
-          </w:tcPr>
-          <w:p>
-            <w:r>
-              <w:t>15:30 A 16:00</w:t>
+              <w:t>DEVAIR</w:t>
+            </w:r>
+          </w:p>
+        </w:tc>
+        <w:tc>
+          <w:tcPr>
+            <w:tcW w:w="1275" w:type="dxa"/>
+          </w:tcPr>
+          <w:p>
+            <w:r>
+              <w:t>16</w:t>
+            </w:r>
+          </w:p>
+        </w:tc>
+        <w:tc>
+          <w:tcPr>
+            <w:tcW w:w="2410" w:type="dxa"/>
+          </w:tcPr>
+          <w:p>
+            <w:r>
+              <w:t>SEG/SEX</w:t>
+            </w:r>
+          </w:p>
+        </w:tc>
+        <w:tc>
+          <w:tcPr>
+            <w:tcW w:w="1018" w:type="dxa"/>
+          </w:tcPr>
+          <w:p/>
+        </w:tc>
+        <w:tc>
+          <w:tcPr>
+            <w:tcW w:w="1018" w:type="dxa"/>
+          </w:tcPr>
+          <w:p>
+            <w:r>
+              <w:t>225,00</w:t>
+            </w:r>
+          </w:p>
+        </w:tc>
+        <w:tc>
+          <w:tcPr>
+            <w:tcW w:w="1018" w:type="dxa"/>
+          </w:tcPr>
+          <w:p/>
+        </w:tc>
+      </w:tr>
+      <w:tr>
+        <w:tc>
+          <w:tcPr>
+            <w:tcW w:w="3823" w:type="dxa"/>
+          </w:tcPr>
+          <w:p>
+            <w:pPr>
+              <w:pStyle w:val="PargrafodaLista"/>
+              <w:numPr>
+                <w:ilvl w:val="0"/>
+                <w:numId w:val="2"/>
+              </w:numPr>
+              <w:jc w:val="both"/>
+            </w:pPr>
+            <w:r>
+              <w:t>LEANDRO BATISTOTI</w:t>
+            </w:r>
+          </w:p>
+        </w:tc>
+        <w:tc>
+          <w:tcPr>
+            <w:tcW w:w="1275" w:type="dxa"/>
+          </w:tcPr>
+          <w:p>
+            <w:r>
+              <w:t>6/18/6</w:t>
+            </w:r>
+          </w:p>
+        </w:tc>
+        <w:tc>
+          <w:tcPr>
+            <w:tcW w:w="2410" w:type="dxa"/>
+          </w:tcPr>
+          <w:p>
+            <w:r>
+              <w:t>TER/QUI/SEX</w:t>
+            </w:r>
+          </w:p>
+        </w:tc>
+        <w:tc>
+          <w:tcPr>
+            <w:tcW w:w="1018" w:type="dxa"/>
+          </w:tcPr>
+          <w:p/>
+        </w:tc>
+        <w:tc>
+          <w:tcPr>
+            <w:tcW w:w="1018" w:type="dxa"/>
+          </w:tcPr>
+          <w:p/>
+        </w:tc>
+        <w:tc>
+          <w:tcPr>
+            <w:tcW w:w="1018" w:type="dxa"/>
+          </w:tcPr>
+          <w:p/>
+        </w:tc>
+      </w:tr>
+      <w:tr>
+        <w:tc>
+          <w:tcPr>
+            <w:tcW w:w="3823" w:type="dxa"/>
+          </w:tcPr>
+          <w:p>
+            <w:pPr>
+              <w:pStyle w:val="PargrafodaLista"/>
+              <w:numPr>
+                <w:ilvl w:val="0"/>
+                <w:numId w:val="2"/>
+              </w:numPr>
+              <w:jc w:val="both"/>
+            </w:pPr>
+            <w:r>
+              <w:t>LUCAS FERREIRA</w:t>
+            </w:r>
+            <w:r>
+              <w:t xml:space="preserve"> 15</w:t>
+            </w:r>
+          </w:p>
+        </w:tc>
+        <w:tc>
+          <w:tcPr>
+            <w:tcW w:w="1275" w:type="dxa"/>
+          </w:tcPr>
+          <w:p>
+            <w:r>
+              <w:t>11</w:t>
+            </w:r>
+          </w:p>
+        </w:tc>
+        <w:tc>
+          <w:tcPr>
+            <w:tcW w:w="2410" w:type="dxa"/>
+          </w:tcPr>
+          <w:p>
+            <w:r>
+              <w:t>SEG/SEX</w:t>
+            </w:r>
+          </w:p>
+        </w:tc>
+        <w:tc>
+          <w:tcPr>
+            <w:tcW w:w="1018" w:type="dxa"/>
+          </w:tcPr>
+          <w:p/>
+        </w:tc>
+        <w:tc>
+          <w:tcPr>
+            <w:tcW w:w="1018" w:type="dxa"/>
+          </w:tcPr>
+          <w:p/>
+        </w:tc>
+        <w:tc>
+          <w:tcPr>
+            <w:tcW w:w="1018" w:type="dxa"/>
+          </w:tcPr>
+          <w:p/>
+        </w:tc>
+      </w:tr>
+      <w:tr>
+        <w:tc>
+          <w:tcPr>
+            <w:tcW w:w="3823" w:type="dxa"/>
+          </w:tcPr>
+          <w:p>
+            <w:pPr>
+              <w:pStyle w:val="PargrafodaLista"/>
+              <w:numPr>
+                <w:ilvl w:val="0"/>
+                <w:numId w:val="2"/>
+              </w:numPr>
+              <w:jc w:val="both"/>
+            </w:pPr>
+            <w:r>
+              <w:t>TELMA YULE</w:t>
+            </w:r>
+          </w:p>
+        </w:tc>
+        <w:tc>
+          <w:tcPr>
+            <w:tcW w:w="1275" w:type="dxa"/>
+          </w:tcPr>
+          <w:p>
+            <w:r>
+              <w:t>8</w:t>
+            </w:r>
+          </w:p>
+        </w:tc>
+        <w:tc>
+          <w:tcPr>
+            <w:tcW w:w="2410" w:type="dxa"/>
+          </w:tcPr>
+          <w:p>
+            <w:r>
+              <w:t>QUA/SEX</w:t>
+            </w:r>
+          </w:p>
+        </w:tc>
+        <w:tc>
+          <w:tcPr>
+            <w:tcW w:w="1018" w:type="dxa"/>
+          </w:tcPr>
+          <w:p/>
+        </w:tc>
+        <w:tc>
+          <w:tcPr>
+            <w:tcW w:w="1018" w:type="dxa"/>
+          </w:tcPr>
+          <w:p/>
+        </w:tc>
+        <w:tc>
+          <w:tcPr>
+            <w:tcW w:w="1018" w:type="dxa"/>
+          </w:tcPr>
+          <w:p/>
+        </w:tc>
+      </w:tr>
+      <w:tr>
+        <w:tc>
+          <w:tcPr>
+            <w:tcW w:w="3823" w:type="dxa"/>
+          </w:tcPr>
+          <w:p>
+            <w:pPr>
+              <w:pStyle w:val="PargrafodaLista"/>
+              <w:numPr>
+                <w:ilvl w:val="0"/>
+                <w:numId w:val="2"/>
+              </w:numPr>
+              <w:jc w:val="both"/>
+            </w:pPr>
+            <w:r>
+              <w:t>FERNANDA OLIVEIRA</w:t>
+            </w:r>
+          </w:p>
+        </w:tc>
+        <w:tc>
+          <w:tcPr>
+            <w:tcW w:w="1275" w:type="dxa"/>
+          </w:tcPr>
+          <w:p>
+            <w:r>
+              <w:t>8</w:t>
             </w:r>
           </w:p>
         </w:tc>
@@ -5592,7 +7600,11 @@
           <w:tcPr>
             <w:tcW w:w="1018" w:type="dxa"/>
           </w:tcPr>
-          <w:p/>
+          <w:p>
+            <w:r>
+              <w:t>365,00</w:t>
+            </w:r>
+          </w:p>
         </w:tc>
         <w:tc>
           <w:tcPr>
@@ -5616,29 +7628,21 @@
               <w:jc w:val="both"/>
             </w:pPr>
             <w:r>
-              <w:t>DR. JULIO 28</w:t>
-            </w:r>
-          </w:p>
-        </w:tc>
-        <w:tc>
-          <w:tcPr>
-            <w:tcW w:w="1275" w:type="dxa"/>
-          </w:tcPr>
-          <w:p>
-            <w:r>
-              <w:t>5:15/8</w:t>
-            </w:r>
-          </w:p>
-        </w:tc>
-        <w:tc>
-          <w:tcPr>
-            <w:tcW w:w="2410" w:type="dxa"/>
-          </w:tcPr>
-          <w:p>
-            <w:r>
-              <w:t>TER/QUI/SÁB</w:t>
-            </w:r>
-          </w:p>
+              <w:t>GABRIELA CADONÁ16</w:t>
+            </w:r>
+          </w:p>
+        </w:tc>
+        <w:tc>
+          <w:tcPr>
+            <w:tcW w:w="1275" w:type="dxa"/>
+          </w:tcPr>
+          <w:p/>
+        </w:tc>
+        <w:tc>
+          <w:tcPr>
+            <w:tcW w:w="2410" w:type="dxa"/>
+          </w:tcPr>
+          <w:p/>
         </w:tc>
         <w:tc>
           <w:tcPr>
@@ -5674,27 +7678,27 @@
               <w:jc w:val="both"/>
             </w:pPr>
             <w:r>
-              <w:t>VITÓRIA GOMES 03</w:t>
-            </w:r>
-          </w:p>
-        </w:tc>
-        <w:tc>
-          <w:tcPr>
-            <w:tcW w:w="1275" w:type="dxa"/>
-          </w:tcPr>
-          <w:p>
-            <w:r>
-              <w:t>6</w:t>
-            </w:r>
-          </w:p>
-        </w:tc>
-        <w:tc>
-          <w:tcPr>
-            <w:tcW w:w="2410" w:type="dxa"/>
-          </w:tcPr>
-          <w:p>
-            <w:r>
-              <w:t>SEG À SEX</w:t>
+              <w:t>THAMARA FAGUNDES</w:t>
+            </w:r>
+          </w:p>
+        </w:tc>
+        <w:tc>
+          <w:tcPr>
+            <w:tcW w:w="1275" w:type="dxa"/>
+          </w:tcPr>
+          <w:p>
+            <w:r>
+              <w:t>9</w:t>
+            </w:r>
+          </w:p>
+        </w:tc>
+        <w:tc>
+          <w:tcPr>
+            <w:tcW w:w="2410" w:type="dxa"/>
+          </w:tcPr>
+          <w:p>
+            <w:r>
+              <w:t>3X</w:t>
             </w:r>
           </w:p>
         </w:tc>
@@ -5732,949 +7736,17 @@
               <w:jc w:val="both"/>
             </w:pPr>
             <w:r>
-              <w:t>ANA PAULA S. 3</w:t>
-            </w:r>
-          </w:p>
-        </w:tc>
-        <w:tc>
-          <w:tcPr>
-            <w:tcW w:w="1275" w:type="dxa"/>
-          </w:tcPr>
-          <w:p>
-            <w:r>
-              <w:t>17/5/5</w:t>
-            </w:r>
-          </w:p>
-        </w:tc>
-        <w:tc>
-          <w:tcPr>
-            <w:tcW w:w="2410" w:type="dxa"/>
-          </w:tcPr>
-          <w:p>
-            <w:r>
-              <w:t>SEG/QUA/SEX</w:t>
-            </w:r>
-          </w:p>
-        </w:tc>
-        <w:tc>
-          <w:tcPr>
-            <w:tcW w:w="1018" w:type="dxa"/>
-          </w:tcPr>
-          <w:p/>
-        </w:tc>
-        <w:tc>
-          <w:tcPr>
-            <w:tcW w:w="1018" w:type="dxa"/>
-          </w:tcPr>
-          <w:p/>
-        </w:tc>
-        <w:tc>
-          <w:tcPr>
-            <w:tcW w:w="1018" w:type="dxa"/>
-          </w:tcPr>
-          <w:p/>
-        </w:tc>
-      </w:tr>
-      <w:tr>
-        <w:tc>
-          <w:tcPr>
-            <w:tcW w:w="3823" w:type="dxa"/>
-          </w:tcPr>
-          <w:p>
-            <w:pPr>
-              <w:pStyle w:val="PargrafodaLista"/>
-              <w:numPr>
-                <w:ilvl w:val="0"/>
-                <w:numId w:val="2"/>
-              </w:numPr>
-              <w:jc w:val="both"/>
-            </w:pPr>
-            <w:r>
-              <w:t>DONA ZILA 3</w:t>
-            </w:r>
-          </w:p>
-        </w:tc>
-        <w:tc>
-          <w:tcPr>
-            <w:tcW w:w="1275" w:type="dxa"/>
-          </w:tcPr>
-          <w:p>
-            <w:r>
-              <w:t>10</w:t>
-            </w:r>
-          </w:p>
-        </w:tc>
-        <w:tc>
-          <w:tcPr>
-            <w:tcW w:w="2410" w:type="dxa"/>
-          </w:tcPr>
-          <w:p>
-            <w:r>
-              <w:t>SEG/QUI</w:t>
-            </w:r>
-          </w:p>
-        </w:tc>
-        <w:tc>
-          <w:tcPr>
-            <w:tcW w:w="1018" w:type="dxa"/>
-          </w:tcPr>
-          <w:p/>
-        </w:tc>
-        <w:tc>
-          <w:tcPr>
-            <w:tcW w:w="1018" w:type="dxa"/>
-          </w:tcPr>
-          <w:p/>
-        </w:tc>
-        <w:tc>
-          <w:tcPr>
-            <w:tcW w:w="1018" w:type="dxa"/>
-          </w:tcPr>
-          <w:p/>
-        </w:tc>
-      </w:tr>
-      <w:tr>
-        <w:tc>
-          <w:tcPr>
-            <w:tcW w:w="3823" w:type="dxa"/>
-          </w:tcPr>
-          <w:p>
-            <w:pPr>
-              <w:pStyle w:val="PargrafodaLista"/>
-              <w:numPr>
-                <w:ilvl w:val="0"/>
-                <w:numId w:val="2"/>
-              </w:numPr>
-              <w:jc w:val="both"/>
-            </w:pPr>
-            <w:r>
-              <w:t>ELISANGELA 13</w:t>
-            </w:r>
-          </w:p>
-        </w:tc>
-        <w:tc>
-          <w:tcPr>
-            <w:tcW w:w="1275" w:type="dxa"/>
-          </w:tcPr>
-          <w:p>
-            <w:r>
-              <w:t>16</w:t>
-            </w:r>
-          </w:p>
-        </w:tc>
-        <w:tc>
-          <w:tcPr>
-            <w:tcW w:w="2410" w:type="dxa"/>
-          </w:tcPr>
-          <w:p>
-            <w:r>
-              <w:t>SEG/TER/QUI</w:t>
-            </w:r>
-          </w:p>
-        </w:tc>
-        <w:tc>
-          <w:tcPr>
-            <w:tcW w:w="1018" w:type="dxa"/>
-          </w:tcPr>
-          <w:p/>
-        </w:tc>
-        <w:tc>
-          <w:tcPr>
-            <w:tcW w:w="1018" w:type="dxa"/>
-          </w:tcPr>
-          <w:p/>
-        </w:tc>
-        <w:tc>
-          <w:tcPr>
-            <w:tcW w:w="1018" w:type="dxa"/>
-          </w:tcPr>
-          <w:p/>
-        </w:tc>
-      </w:tr>
-      <w:tr>
-        <w:tc>
-          <w:tcPr>
-            <w:tcW w:w="3823" w:type="dxa"/>
-          </w:tcPr>
-          <w:p>
-            <w:pPr>
-              <w:pStyle w:val="PargrafodaLista"/>
-              <w:numPr>
-                <w:ilvl w:val="0"/>
-                <w:numId w:val="2"/>
-              </w:numPr>
-              <w:jc w:val="both"/>
-            </w:pPr>
-            <w:r>
-              <w:t>CRISTIANE 27</w:t>
-            </w:r>
-          </w:p>
-        </w:tc>
-        <w:tc>
-          <w:tcPr>
-            <w:tcW w:w="1275" w:type="dxa"/>
-          </w:tcPr>
-          <w:p>
-            <w:r>
-              <w:t>6</w:t>
-            </w:r>
-          </w:p>
-        </w:tc>
-        <w:tc>
-          <w:tcPr>
-            <w:tcW w:w="2410" w:type="dxa"/>
-          </w:tcPr>
-          <w:p>
-            <w:r>
-              <w:t>SEG/QUA/QUI</w:t>
-            </w:r>
-          </w:p>
-        </w:tc>
-        <w:tc>
-          <w:tcPr>
-            <w:tcW w:w="1018" w:type="dxa"/>
-          </w:tcPr>
-          <w:p/>
-        </w:tc>
-        <w:tc>
-          <w:tcPr>
-            <w:tcW w:w="1018" w:type="dxa"/>
-          </w:tcPr>
-          <w:p/>
-        </w:tc>
-        <w:tc>
-          <w:tcPr>
-            <w:tcW w:w="1018" w:type="dxa"/>
-          </w:tcPr>
-          <w:p/>
-        </w:tc>
-      </w:tr>
-      <w:tr>
-        <w:tc>
-          <w:tcPr>
-            <w:tcW w:w="3823" w:type="dxa"/>
-          </w:tcPr>
-          <w:p>
-            <w:pPr>
-              <w:pStyle w:val="PargrafodaLista"/>
-              <w:numPr>
-                <w:ilvl w:val="0"/>
-                <w:numId w:val="2"/>
-              </w:numPr>
-              <w:jc w:val="both"/>
-            </w:pPr>
-            <w:r>
-              <w:t>FABIOLA 25</w:t>
-            </w:r>
-          </w:p>
-        </w:tc>
-        <w:tc>
-          <w:tcPr>
-            <w:tcW w:w="1275" w:type="dxa"/>
-          </w:tcPr>
-          <w:p>
-            <w:r>
-              <w:t>17</w:t>
-            </w:r>
-          </w:p>
-        </w:tc>
-        <w:tc>
-          <w:tcPr>
-            <w:tcW w:w="2410" w:type="dxa"/>
-          </w:tcPr>
-          <w:p>
-            <w:r>
-              <w:t>TER/QUA/QUI</w:t>
-            </w:r>
-          </w:p>
-        </w:tc>
-        <w:tc>
-          <w:tcPr>
-            <w:tcW w:w="1018" w:type="dxa"/>
-          </w:tcPr>
-          <w:p/>
-        </w:tc>
-        <w:tc>
-          <w:tcPr>
-            <w:tcW w:w="1018" w:type="dxa"/>
-          </w:tcPr>
-          <w:p/>
-        </w:tc>
-        <w:tc>
-          <w:tcPr>
-            <w:tcW w:w="1018" w:type="dxa"/>
-          </w:tcPr>
-          <w:p/>
-        </w:tc>
-      </w:tr>
-      <w:tr>
-        <w:tc>
-          <w:tcPr>
-            <w:tcW w:w="3823" w:type="dxa"/>
-          </w:tcPr>
-          <w:p>
-            <w:pPr>
-              <w:pStyle w:val="PargrafodaLista"/>
-              <w:numPr>
-                <w:ilvl w:val="0"/>
-                <w:numId w:val="2"/>
-              </w:numPr>
-              <w:jc w:val="both"/>
-            </w:pPr>
-            <w:r>
-              <w:t>ANA PAULA BIAZO. 1</w:t>
-            </w:r>
-          </w:p>
-        </w:tc>
-        <w:tc>
-          <w:tcPr>
-            <w:tcW w:w="1275" w:type="dxa"/>
-          </w:tcPr>
-          <w:p>
-            <w:r>
-              <w:t>9</w:t>
-            </w:r>
-          </w:p>
-        </w:tc>
-        <w:tc>
-          <w:tcPr>
-            <w:tcW w:w="2410" w:type="dxa"/>
-          </w:tcPr>
-          <w:p>
-            <w:r>
-              <w:t>SEG/QUA/SEX</w:t>
-            </w:r>
-          </w:p>
-        </w:tc>
-        <w:tc>
-          <w:tcPr>
-            <w:tcW w:w="1018" w:type="dxa"/>
-          </w:tcPr>
-          <w:p/>
-        </w:tc>
-        <w:tc>
-          <w:tcPr>
-            <w:tcW w:w="1018" w:type="dxa"/>
-          </w:tcPr>
-          <w:p/>
-        </w:tc>
-        <w:tc>
-          <w:tcPr>
-            <w:tcW w:w="1018" w:type="dxa"/>
-          </w:tcPr>
-          <w:p/>
-        </w:tc>
-      </w:tr>
-      <w:tr>
-        <w:tc>
-          <w:tcPr>
-            <w:tcW w:w="3823" w:type="dxa"/>
-          </w:tcPr>
-          <w:p>
-            <w:pPr>
-              <w:pStyle w:val="PargrafodaLista"/>
-              <w:numPr>
-                <w:ilvl w:val="0"/>
-                <w:numId w:val="2"/>
-              </w:numPr>
-              <w:jc w:val="both"/>
-            </w:pPr>
-            <w:r>
-              <w:t>LILLYAN 3</w:t>
-            </w:r>
-          </w:p>
-        </w:tc>
-        <w:tc>
-          <w:tcPr>
-            <w:tcW w:w="1275" w:type="dxa"/>
-          </w:tcPr>
-          <w:p>
-            <w:r>
-              <w:t>7</w:t>
-            </w:r>
-          </w:p>
-        </w:tc>
-        <w:tc>
-          <w:tcPr>
-            <w:tcW w:w="2410" w:type="dxa"/>
-          </w:tcPr>
-          <w:p>
-            <w:r>
-              <w:t>SEG À SEX</w:t>
-            </w:r>
-          </w:p>
-        </w:tc>
-        <w:tc>
-          <w:tcPr>
-            <w:tcW w:w="1018" w:type="dxa"/>
-          </w:tcPr>
-          <w:p/>
-        </w:tc>
-        <w:tc>
-          <w:tcPr>
-            <w:tcW w:w="1018" w:type="dxa"/>
-          </w:tcPr>
-          <w:p/>
-        </w:tc>
-        <w:tc>
-          <w:tcPr>
-            <w:tcW w:w="1018" w:type="dxa"/>
-          </w:tcPr>
-          <w:p/>
-        </w:tc>
-      </w:tr>
-      <w:tr>
-        <w:tc>
-          <w:tcPr>
-            <w:tcW w:w="3823" w:type="dxa"/>
-          </w:tcPr>
-          <w:p>
-            <w:pPr>
-              <w:pStyle w:val="PargrafodaLista"/>
-              <w:numPr>
-                <w:ilvl w:val="0"/>
-                <w:numId w:val="2"/>
-              </w:numPr>
-              <w:jc w:val="both"/>
-            </w:pPr>
-            <w:r>
-              <w:t>DANIELA RUCH 3</w:t>
-            </w:r>
-          </w:p>
-        </w:tc>
-        <w:tc>
-          <w:tcPr>
-            <w:tcW w:w="1275" w:type="dxa"/>
-          </w:tcPr>
-          <w:p>
-            <w:r>
-              <w:t>17</w:t>
-            </w:r>
-          </w:p>
-        </w:tc>
-        <w:tc>
-          <w:tcPr>
-            <w:tcW w:w="2410" w:type="dxa"/>
-          </w:tcPr>
-          <w:p>
-            <w:r>
-              <w:t>QUA/SEX</w:t>
-            </w:r>
-          </w:p>
-        </w:tc>
-        <w:tc>
-          <w:tcPr>
-            <w:tcW w:w="1018" w:type="dxa"/>
-          </w:tcPr>
-          <w:p/>
-        </w:tc>
-        <w:tc>
-          <w:tcPr>
-            <w:tcW w:w="1018" w:type="dxa"/>
-          </w:tcPr>
-          <w:p/>
-        </w:tc>
-        <w:tc>
-          <w:tcPr>
-            <w:tcW w:w="1018" w:type="dxa"/>
-          </w:tcPr>
-          <w:p/>
-        </w:tc>
-      </w:tr>
-      <w:tr>
-        <w:tc>
-          <w:tcPr>
-            <w:tcW w:w="3823" w:type="dxa"/>
-          </w:tcPr>
-          <w:p>
-            <w:pPr>
-              <w:pStyle w:val="PargrafodaLista"/>
-              <w:numPr>
-                <w:ilvl w:val="0"/>
-                <w:numId w:val="2"/>
-              </w:numPr>
-              <w:jc w:val="both"/>
-            </w:pPr>
-            <w:r>
-              <w:t>CYNTIA ROCHA 9</w:t>
-            </w:r>
-          </w:p>
-        </w:tc>
-        <w:tc>
-          <w:tcPr>
-            <w:tcW w:w="1275" w:type="dxa"/>
-          </w:tcPr>
-          <w:p>
-            <w:r>
-              <w:t>13:30</w:t>
-            </w:r>
-          </w:p>
-        </w:tc>
-        <w:tc>
-          <w:tcPr>
-            <w:tcW w:w="2410" w:type="dxa"/>
-          </w:tcPr>
-          <w:p>
-            <w:r>
-              <w:t>SEG/QUA/SEX</w:t>
-            </w:r>
-          </w:p>
-        </w:tc>
-        <w:tc>
-          <w:tcPr>
-            <w:tcW w:w="1018" w:type="dxa"/>
-          </w:tcPr>
-          <w:p/>
-        </w:tc>
-        <w:tc>
-          <w:tcPr>
-            <w:tcW w:w="1018" w:type="dxa"/>
-          </w:tcPr>
-          <w:p/>
-        </w:tc>
-        <w:tc>
-          <w:tcPr>
-            <w:tcW w:w="1018" w:type="dxa"/>
-          </w:tcPr>
-          <w:p/>
-        </w:tc>
-      </w:tr>
-      <w:tr>
-        <w:tc>
-          <w:tcPr>
-            <w:tcW w:w="3823" w:type="dxa"/>
-          </w:tcPr>
-          <w:p>
-            <w:pPr>
-              <w:pStyle w:val="PargrafodaLista"/>
-              <w:numPr>
-                <w:ilvl w:val="0"/>
-                <w:numId w:val="2"/>
-              </w:numPr>
-              <w:jc w:val="both"/>
-            </w:pPr>
-            <w:r>
-              <w:t>ILIÊ VIDAL</w:t>
-            </w:r>
-          </w:p>
-        </w:tc>
-        <w:tc>
-          <w:tcPr>
-            <w:tcW w:w="1275" w:type="dxa"/>
-          </w:tcPr>
-          <w:p>
-            <w:r>
-              <w:t>15</w:t>
-            </w:r>
-          </w:p>
-        </w:tc>
-        <w:tc>
-          <w:tcPr>
-            <w:tcW w:w="2410" w:type="dxa"/>
-          </w:tcPr>
-          <w:p>
-            <w:r>
-              <w:t>SEG/QUA/SEX</w:t>
-            </w:r>
-          </w:p>
-        </w:tc>
-        <w:tc>
-          <w:tcPr>
-            <w:tcW w:w="1018" w:type="dxa"/>
-          </w:tcPr>
-          <w:p/>
-        </w:tc>
-        <w:tc>
-          <w:tcPr>
-            <w:tcW w:w="1018" w:type="dxa"/>
-          </w:tcPr>
-          <w:p>
-            <w:r>
-              <w:t>350,00</w:t>
-            </w:r>
-          </w:p>
-        </w:tc>
-        <w:tc>
-          <w:tcPr>
-            <w:tcW w:w="1018" w:type="dxa"/>
-          </w:tcPr>
-          <w:p/>
-        </w:tc>
-      </w:tr>
-      <w:tr>
-        <w:tc>
-          <w:tcPr>
-            <w:tcW w:w="3823" w:type="dxa"/>
-          </w:tcPr>
-          <w:p>
-            <w:pPr>
-              <w:pStyle w:val="PargrafodaLista"/>
-              <w:numPr>
-                <w:ilvl w:val="0"/>
-                <w:numId w:val="2"/>
-              </w:numPr>
-              <w:jc w:val="both"/>
-            </w:pPr>
-            <w:r>
-              <w:t>KATHELYN</w:t>
-            </w:r>
-          </w:p>
-        </w:tc>
-        <w:tc>
-          <w:tcPr>
-            <w:tcW w:w="1275" w:type="dxa"/>
-          </w:tcPr>
-          <w:p>
-            <w:r>
-              <w:t>6</w:t>
-            </w:r>
-          </w:p>
-        </w:tc>
-        <w:tc>
-          <w:tcPr>
-            <w:tcW w:w="2410" w:type="dxa"/>
-          </w:tcPr>
-          <w:p>
-            <w:r>
-              <w:t>SEG/QUA/SEX</w:t>
-            </w:r>
-          </w:p>
-        </w:tc>
-        <w:tc>
-          <w:tcPr>
-            <w:tcW w:w="1018" w:type="dxa"/>
-          </w:tcPr>
-          <w:p/>
-        </w:tc>
-        <w:tc>
-          <w:tcPr>
-            <w:tcW w:w="1018" w:type="dxa"/>
-          </w:tcPr>
-          <w:p/>
-        </w:tc>
-        <w:tc>
-          <w:tcPr>
-            <w:tcW w:w="1018" w:type="dxa"/>
-          </w:tcPr>
-          <w:p/>
-        </w:tc>
-      </w:tr>
-      <w:tr>
-        <w:tc>
-          <w:tcPr>
-            <w:tcW w:w="3823" w:type="dxa"/>
-          </w:tcPr>
-          <w:p>
-            <w:pPr>
-              <w:pStyle w:val="PargrafodaLista"/>
-              <w:numPr>
-                <w:ilvl w:val="0"/>
-                <w:numId w:val="2"/>
-              </w:numPr>
-              <w:jc w:val="both"/>
-            </w:pPr>
-            <w:r>
-              <w:t>NÁDIA ROCHA</w:t>
-            </w:r>
-          </w:p>
-        </w:tc>
-        <w:tc>
-          <w:tcPr>
-            <w:tcW w:w="1275" w:type="dxa"/>
-          </w:tcPr>
-          <w:p>
-            <w:r>
-              <w:t>5</w:t>
-            </w:r>
-          </w:p>
-        </w:tc>
-        <w:tc>
-          <w:tcPr>
-            <w:tcW w:w="2410" w:type="dxa"/>
-          </w:tcPr>
-          <w:p>
-            <w:r>
-              <w:t>TER/QUA</w:t>
-            </w:r>
-          </w:p>
-        </w:tc>
-        <w:tc>
-          <w:tcPr>
-            <w:tcW w:w="1018" w:type="dxa"/>
-          </w:tcPr>
-          <w:p/>
-        </w:tc>
-        <w:tc>
-          <w:tcPr>
-            <w:tcW w:w="1018" w:type="dxa"/>
-          </w:tcPr>
-          <w:p/>
-        </w:tc>
-        <w:tc>
-          <w:tcPr>
-            <w:tcW w:w="1018" w:type="dxa"/>
-          </w:tcPr>
-          <w:p/>
-        </w:tc>
-      </w:tr>
-      <w:tr>
-        <w:tc>
-          <w:tcPr>
-            <w:tcW w:w="3823" w:type="dxa"/>
-          </w:tcPr>
-          <w:p>
-            <w:pPr>
-              <w:pStyle w:val="PargrafodaLista"/>
-              <w:numPr>
-                <w:ilvl w:val="0"/>
-                <w:numId w:val="2"/>
-              </w:numPr>
-              <w:jc w:val="both"/>
-            </w:pPr>
-            <w:r>
-              <w:t>ELIEZER ROCHA</w:t>
-            </w:r>
-          </w:p>
-        </w:tc>
-        <w:tc>
-          <w:tcPr>
-            <w:tcW w:w="1275" w:type="dxa"/>
-          </w:tcPr>
-          <w:p>
-            <w:r>
-              <w:t>5</w:t>
-            </w:r>
-          </w:p>
-        </w:tc>
-        <w:tc>
-          <w:tcPr>
-            <w:tcW w:w="2410" w:type="dxa"/>
-          </w:tcPr>
-          <w:p>
-            <w:r>
-              <w:t>TER/QUI</w:t>
-            </w:r>
-          </w:p>
-        </w:tc>
-        <w:tc>
-          <w:tcPr>
-            <w:tcW w:w="1018" w:type="dxa"/>
-          </w:tcPr>
-          <w:p/>
-        </w:tc>
-        <w:tc>
-          <w:tcPr>
-            <w:tcW w:w="1018" w:type="dxa"/>
-          </w:tcPr>
-          <w:p/>
-        </w:tc>
-        <w:tc>
-          <w:tcPr>
-            <w:tcW w:w="1018" w:type="dxa"/>
-          </w:tcPr>
-          <w:p/>
-        </w:tc>
-      </w:tr>
-      <w:tr>
-        <w:tc>
-          <w:tcPr>
-            <w:tcW w:w="3823" w:type="dxa"/>
-          </w:tcPr>
-          <w:p>
-            <w:pPr>
-              <w:pStyle w:val="PargrafodaLista"/>
-              <w:numPr>
-                <w:ilvl w:val="0"/>
-                <w:numId w:val="2"/>
-              </w:numPr>
-              <w:jc w:val="both"/>
-            </w:pPr>
-            <w:r>
-              <w:t xml:space="preserve">TATIANA </w:t>
-            </w:r>
-          </w:p>
-        </w:tc>
-        <w:tc>
-          <w:tcPr>
-            <w:tcW w:w="1275" w:type="dxa"/>
-          </w:tcPr>
-          <w:p>
-            <w:r>
-              <w:t>5</w:t>
-            </w:r>
-          </w:p>
-        </w:tc>
-        <w:tc>
-          <w:tcPr>
-            <w:tcW w:w="2410" w:type="dxa"/>
-          </w:tcPr>
-          <w:p>
-            <w:r>
-              <w:t>TER/QUI</w:t>
-            </w:r>
-          </w:p>
-        </w:tc>
-        <w:tc>
-          <w:tcPr>
-            <w:tcW w:w="1018" w:type="dxa"/>
-          </w:tcPr>
-          <w:p/>
-        </w:tc>
-        <w:tc>
-          <w:tcPr>
-            <w:tcW w:w="1018" w:type="dxa"/>
-          </w:tcPr>
-          <w:p>
-            <w:r>
-              <w:t>350,00</w:t>
-            </w:r>
-          </w:p>
-        </w:tc>
-        <w:tc>
-          <w:tcPr>
-            <w:tcW w:w="1018" w:type="dxa"/>
-          </w:tcPr>
-          <w:p/>
-        </w:tc>
-      </w:tr>
-      <w:tr>
-        <w:tc>
-          <w:tcPr>
-            <w:tcW w:w="3823" w:type="dxa"/>
-          </w:tcPr>
-          <w:p>
-            <w:pPr>
-              <w:pStyle w:val="PargrafodaLista"/>
-              <w:numPr>
-                <w:ilvl w:val="0"/>
-                <w:numId w:val="2"/>
-              </w:numPr>
-              <w:jc w:val="both"/>
-            </w:pPr>
-            <w:r>
-              <w:t>BRUNO AGUIAR</w:t>
-            </w:r>
-          </w:p>
-        </w:tc>
-        <w:tc>
-          <w:tcPr>
-            <w:tcW w:w="1275" w:type="dxa"/>
-          </w:tcPr>
-          <w:p>
-            <w:r>
-              <w:t>5</w:t>
-            </w:r>
-          </w:p>
-        </w:tc>
-        <w:tc>
-          <w:tcPr>
-            <w:tcW w:w="2410" w:type="dxa"/>
-          </w:tcPr>
-          <w:p>
-            <w:r>
-              <w:t>QUA/SEX</w:t>
-            </w:r>
-          </w:p>
-        </w:tc>
-        <w:tc>
-          <w:tcPr>
-            <w:tcW w:w="1018" w:type="dxa"/>
-          </w:tcPr>
-          <w:p/>
-        </w:tc>
-        <w:tc>
-          <w:tcPr>
-            <w:tcW w:w="1018" w:type="dxa"/>
-          </w:tcPr>
-          <w:p/>
-        </w:tc>
-        <w:tc>
-          <w:tcPr>
-            <w:tcW w:w="1018" w:type="dxa"/>
-          </w:tcPr>
-          <w:p/>
-        </w:tc>
-      </w:tr>
-      <w:tr>
-        <w:tc>
-          <w:tcPr>
-            <w:tcW w:w="3823" w:type="dxa"/>
-          </w:tcPr>
-          <w:p>
-            <w:pPr>
-              <w:pStyle w:val="PargrafodaLista"/>
-              <w:numPr>
-                <w:ilvl w:val="0"/>
-                <w:numId w:val="2"/>
-              </w:numPr>
-              <w:jc w:val="both"/>
-            </w:pPr>
-            <w:r>
-              <w:t>BACANINHA</w:t>
-            </w:r>
-          </w:p>
-        </w:tc>
-        <w:tc>
-          <w:tcPr>
-            <w:tcW w:w="1275" w:type="dxa"/>
-          </w:tcPr>
-          <w:p>
-            <w:r>
-              <w:t>5</w:t>
-            </w:r>
-          </w:p>
-        </w:tc>
-        <w:tc>
-          <w:tcPr>
-            <w:tcW w:w="2410" w:type="dxa"/>
-          </w:tcPr>
-          <w:p/>
-        </w:tc>
-        <w:tc>
-          <w:tcPr>
-            <w:tcW w:w="1018" w:type="dxa"/>
-          </w:tcPr>
-          <w:p/>
-        </w:tc>
-        <w:tc>
-          <w:tcPr>
-            <w:tcW w:w="1018" w:type="dxa"/>
-          </w:tcPr>
-          <w:p/>
-        </w:tc>
-        <w:tc>
-          <w:tcPr>
-            <w:tcW w:w="1018" w:type="dxa"/>
-          </w:tcPr>
-          <w:p/>
-        </w:tc>
-      </w:tr>
-      <w:tr>
-        <w:tc>
-          <w:tcPr>
-            <w:tcW w:w="3823" w:type="dxa"/>
-          </w:tcPr>
-          <w:p>
-            <w:pPr>
-              <w:pStyle w:val="PargrafodaLista"/>
-              <w:numPr>
-                <w:ilvl w:val="0"/>
-                <w:numId w:val="2"/>
-              </w:numPr>
-              <w:jc w:val="both"/>
-            </w:pPr>
-            <w:r>
-              <w:t>MARISA</w:t>
-            </w:r>
-          </w:p>
-        </w:tc>
-        <w:tc>
-          <w:tcPr>
-            <w:tcW w:w="1275" w:type="dxa"/>
-          </w:tcPr>
-          <w:p>
-            <w:r>
-              <w:t>9</w:t>
+              <w:t>ANDRESSA LIMA</w:t>
+            </w:r>
+          </w:p>
+        </w:tc>
+        <w:tc>
+          <w:tcPr>
+            <w:tcW w:w="1275" w:type="dxa"/>
+          </w:tcPr>
+          <w:p>
+            <w:r>
+              <w:t>8</w:t>
             </w:r>
           </w:p>
         </w:tc>

</xml_diff>